<commit_message>
Add bt lab 5 ver 2.0
</commit_message>
<xml_diff>
--- a/LAB5/LAB05_BùiNgôQuangLý_1250080112_CNPM2_PPPTPMHDT.docx
+++ b/LAB5/LAB05_BùiNgôQuangLý_1250080112_CNPM2_PPPTPMHDT.docx
@@ -784,6 +784,9 @@
         <w:t xml:space="preserve">Tìm mối liên kết giữa các Class. </w:t>
       </w:r>
       <w:r>
+        <w:rPr>
+          <w:lang w:val="vi-VN"/>
+        </w:rPr>
         <w:t>Dùng StarUML vẽ Class Diagram, chú ý các ký hiệu thích hợp cùng bản số tương ứng (nếu có).</w:t>
       </w:r>
     </w:p>
@@ -863,11 +866,18 @@
         <w:rPr>
           <w:b/>
           <w:bCs/>
+          <w:lang w:val="vi-VN"/>
         </w:rPr>
         <w:t xml:space="preserve">3) </w:t>
       </w:r>
       <w:r>
-        <w:t>Hãy xác định các Actor và các Use Case tổng quát có trong mô tả trên. Sử dụng StarUML, vẽ Use Case Diagram tổng quát cho toàn bộ hệ thống. Mô hình đảm bảo cho phép quản lý toàn bộ các loại thực thể và các xử lý cần thiết liên quan. Lưu file bài làm và mô hình với tên phù hợp.</w:t>
+        <w:rPr>
+          <w:lang w:val="vi-VN"/>
+        </w:rPr>
+        <w:t xml:space="preserve">Hãy xác định các Actor và các Use Case tổng quát có trong mô tả trên. </w:t>
+      </w:r>
+      <w:r>
+        <w:t>Sử dụng StarUML, vẽ Use Case Diagram tổng quát cho toàn bộ hệ thống. Mô hình đảm bảo cho phép quản lý toàn bộ các loại thực thể và các xử lý cần thiết liên quan. Lưu file bài làm và mô hình với tên phù hợp.</w:t>
       </w:r>
     </w:p>
     <w:p>
@@ -924,15 +934,22 @@
         </w:numPr>
         <w:spacing w:after="120" w:line="300" w:lineRule="auto"/>
         <w:jc w:val="both"/>
+        <w:rPr>
+          <w:lang w:val="vi-VN"/>
+        </w:rPr>
       </w:pPr>
       <w:r>
         <w:rPr>
           <w:b/>
           <w:bCs/>
+          <w:lang w:val="vi-VN"/>
         </w:rPr>
         <w:t>Nhân viên</w:t>
       </w:r>
       <w:r>
+        <w:rPr>
+          <w:lang w:val="vi-VN"/>
+        </w:rPr>
         <w:t>: Bao gồm các bộ phận nghiệp vụ (bán vé, điều hành tour, hướng dẫn viên, kế toán) thực hiện quản lý danh mục tour/chuyến đi, lập phiếu/bán vé, phân công lịch hướng dẫn viên, thanh toán kinh phí và tính lương.</w:t>
       </w:r>
     </w:p>
@@ -944,15 +961,22 @@
         </w:numPr>
         <w:spacing w:after="120" w:line="300" w:lineRule="auto"/>
         <w:jc w:val="both"/>
+        <w:rPr>
+          <w:lang w:val="vi-VN"/>
+        </w:rPr>
       </w:pPr>
       <w:r>
         <w:rPr>
           <w:b/>
           <w:bCs/>
+          <w:lang w:val="vi-VN"/>
         </w:rPr>
         <w:t>Admin (Quản trị viên)</w:t>
       </w:r>
       <w:r>
+        <w:rPr>
+          <w:lang w:val="vi-VN"/>
+        </w:rPr>
         <w:t>: Người quản trị hệ thống, chịu trách nhiệm quản lý tài khoản người dùng, phân quyền truy cập, cấu hình tham số hệ thống, quản lý danh mục dùng chung và bảo mật/sao lưu dữ liệu.</w:t>
       </w:r>
     </w:p>
@@ -1324,6 +1348,9 @@
               </w:rPr>
             </w:pPr>
             <w:r>
+              <w:rPr>
+                <w:lang w:val="vi-VN"/>
+              </w:rPr>
               <w:t>1. Khách hàng lựa chọn hình thức đăng ký: Tour lẻ (dưới 12 người) hoặc Tour đoàn (từ 12 người trở lên).</w:t>
             </w:r>
           </w:p>
@@ -1342,6 +1369,9 @@
               <w:t xml:space="preserve">2. Đối với Khách lẻ: Khách chọn Tour, Chuyến đi (ngày đi/ngày về cố định) và chọn Điểm đón quy định. </w:t>
             </w:r>
             <w:r>
+              <w:rPr>
+                <w:lang w:val="vi-VN"/>
+              </w:rPr>
               <w:t>Khách hàng thanh toán 100% tiền vé. Nhân viên xuất vé cho khách.</w:t>
             </w:r>
           </w:p>
@@ -1360,6 +1390,9 @@
               <w:t xml:space="preserve">3. Đối với Khách đoàn: Đại diện đoàn chọn Tour, chọn Ngày đi tùy ý, cung cấp thông tin cơ quan/đại diện và Yêu cầu điểm đón. </w:t>
             </w:r>
             <w:r>
+              <w:rPr>
+                <w:lang w:val="vi-VN"/>
+              </w:rPr>
               <w:t>Khách cung cấp Danh sách người đi nếu mua bảo hiểm. Khách tiến hành nộp tiền đặt cọc. Nhân viên lập Phiếu đăng ký tour đoàn và Biên nhận cọc.</w:t>
             </w:r>
           </w:p>
@@ -1409,14 +1442,20 @@
             <w:pPr>
               <w:spacing w:after="120" w:line="300" w:lineRule="auto"/>
               <w:ind w:left="504" w:hanging="504"/>
-            </w:pPr>
-            <w:r>
               <w:rPr>
                 <w:lang w:val="vi-VN"/>
               </w:rPr>
+            </w:pPr>
+            <w:r>
+              <w:rPr>
+                <w:lang w:val="vi-VN"/>
+              </w:rPr>
               <w:t xml:space="preserve">7. Hệ thống gửi Phiếu khảo sát ý kiến. </w:t>
             </w:r>
             <w:r>
+              <w:rPr>
+                <w:lang w:val="vi-VN"/>
+              </w:rPr>
               <w:t>Khách hàng thực hiện đánh giá và gửi phản hồi.</w:t>
             </w:r>
           </w:p>
@@ -2049,6 +2088,7 @@
                 <w:b/>
                 <w:bCs/>
               </w:rPr>
+              <w:lastRenderedPageBreak/>
               <w:t>Luồng phụ (Alternative flow)</w:t>
             </w:r>
           </w:p>
@@ -2287,6 +2327,7 @@
         <w:rPr>
           <w:b/>
           <w:bCs/>
+          <w:noProof/>
           <w:lang w:val="vi-VN"/>
         </w:rPr>
         <w:drawing>
@@ -2326,6 +2367,270 @@
         </w:drawing>
       </w:r>
     </w:p>
+    <w:tbl>
+      <w:tblPr>
+        <w:tblStyle w:val="TableGrid"/>
+        <w:tblW w:w="0" w:type="auto"/>
+        <w:tblLook w:val="04A0" w:firstRow="1" w:lastRow="0" w:firstColumn="1" w:lastColumn="0" w:noHBand="0" w:noVBand="1"/>
+      </w:tblPr>
+      <w:tblGrid>
+        <w:gridCol w:w="1841"/>
+        <w:gridCol w:w="7503"/>
+      </w:tblGrid>
+      <w:tr>
+        <w:tc>
+          <w:tcPr>
+            <w:tcW w:w="0" w:type="auto"/>
+            <w:hideMark/>
+          </w:tcPr>
+          <w:p>
+            <w:pPr>
+              <w:spacing w:after="120" w:line="300" w:lineRule="auto"/>
+              <w:jc w:val="both"/>
+              <w:rPr>
+                <w:b/>
+                <w:bCs/>
+              </w:rPr>
+            </w:pPr>
+            <w:r>
+              <w:rPr>
+                <w:b/>
+                <w:bCs/>
+              </w:rPr>
+              <w:t>Thuộc tính</w:t>
+            </w:r>
+          </w:p>
+        </w:tc>
+        <w:tc>
+          <w:tcPr>
+            <w:tcW w:w="0" w:type="auto"/>
+            <w:hideMark/>
+          </w:tcPr>
+          <w:p>
+            <w:pPr>
+              <w:spacing w:after="120" w:line="300" w:lineRule="auto"/>
+              <w:ind w:left="504" w:hanging="504"/>
+              <w:jc w:val="both"/>
+              <w:rPr>
+                <w:b/>
+                <w:bCs/>
+              </w:rPr>
+            </w:pPr>
+            <w:r>
+              <w:rPr>
+                <w:b/>
+                <w:bCs/>
+              </w:rPr>
+              <w:t>Thiết kế</w:t>
+            </w:r>
+          </w:p>
+        </w:tc>
+      </w:tr>
+      <w:tr>
+        <w:tc>
+          <w:tcPr>
+            <w:tcW w:w="0" w:type="auto"/>
+            <w:hideMark/>
+          </w:tcPr>
+          <w:p>
+            <w:pPr>
+              <w:spacing w:after="120" w:line="300" w:lineRule="auto"/>
+              <w:jc w:val="both"/>
+            </w:pPr>
+            <w:r>
+              <w:t>Mục đích</w:t>
+            </w:r>
+          </w:p>
+        </w:tc>
+        <w:tc>
+          <w:tcPr>
+            <w:tcW w:w="0" w:type="auto"/>
+            <w:hideMark/>
+          </w:tcPr>
+          <w:p>
+            <w:pPr>
+              <w:spacing w:after="120" w:line="300" w:lineRule="auto"/>
+              <w:ind w:left="29" w:hanging="29"/>
+              <w:jc w:val="both"/>
+            </w:pPr>
+            <w:r>
+              <w:t>Làm Form giao diện chính (MDI/Dashboard container) điều hướng và hiển thị các Form con vào vùng làm việc chung.</w:t>
+            </w:r>
+          </w:p>
+        </w:tc>
+      </w:tr>
+      <w:tr>
+        <w:tc>
+          <w:tcPr>
+            <w:tcW w:w="0" w:type="auto"/>
+            <w:hideMark/>
+          </w:tcPr>
+          <w:p>
+            <w:pPr>
+              <w:spacing w:after="120" w:line="300" w:lineRule="auto"/>
+              <w:jc w:val="both"/>
+            </w:pPr>
+            <w:r>
+              <w:lastRenderedPageBreak/>
+              <w:t>Đối tượng sử dụng</w:t>
+            </w:r>
+          </w:p>
+        </w:tc>
+        <w:tc>
+          <w:tcPr>
+            <w:tcW w:w="0" w:type="auto"/>
+            <w:hideMark/>
+          </w:tcPr>
+          <w:p>
+            <w:pPr>
+              <w:spacing w:after="120" w:line="300" w:lineRule="auto"/>
+              <w:ind w:left="29" w:hanging="29"/>
+              <w:jc w:val="both"/>
+            </w:pPr>
+            <w:r>
+              <w:t>Tất cả người dùng hệ thống (Admin, Bán vé, Điều hành, Kế toán).</w:t>
+            </w:r>
+          </w:p>
+        </w:tc>
+      </w:tr>
+      <w:tr>
+        <w:tc>
+          <w:tcPr>
+            <w:tcW w:w="0" w:type="auto"/>
+            <w:hideMark/>
+          </w:tcPr>
+          <w:p>
+            <w:pPr>
+              <w:spacing w:after="120" w:line="300" w:lineRule="auto"/>
+              <w:jc w:val="both"/>
+            </w:pPr>
+            <w:r>
+              <w:t>Đọc/Ghi dữ liệu</w:t>
+            </w:r>
+          </w:p>
+        </w:tc>
+        <w:tc>
+          <w:tcPr>
+            <w:tcW w:w="0" w:type="auto"/>
+            <w:hideMark/>
+          </w:tcPr>
+          <w:p>
+            <w:pPr>
+              <w:spacing w:after="120" w:line="300" w:lineRule="auto"/>
+              <w:ind w:left="29" w:hanging="29"/>
+              <w:jc w:val="both"/>
+              <w:rPr>
+                <w:lang w:val="vi-VN"/>
+              </w:rPr>
+            </w:pPr>
+            <w:r>
+              <w:t>- Đọc: Kiểm tra trạng thái kết nối CSDL qua bảng Tour.</w:t>
+            </w:r>
+          </w:p>
+          <w:p>
+            <w:pPr>
+              <w:spacing w:after="120" w:line="300" w:lineRule="auto"/>
+              <w:ind w:left="29" w:hanging="29"/>
+              <w:jc w:val="both"/>
+              <w:rPr>
+                <w:lang w:val="vi-VN"/>
+              </w:rPr>
+            </w:pPr>
+            <w:r>
+              <w:rPr>
+                <w:lang w:val="vi-VN"/>
+              </w:rPr>
+              <w:t>- Ghi: Không trực tiếp ghi CSDL (chỉ quản lý luồng chuyển Form).</w:t>
+            </w:r>
+          </w:p>
+        </w:tc>
+      </w:tr>
+      <w:tr>
+        <w:tc>
+          <w:tcPr>
+            <w:tcW w:w="0" w:type="auto"/>
+            <w:hideMark/>
+          </w:tcPr>
+          <w:p>
+            <w:pPr>
+              <w:spacing w:after="120" w:line="300" w:lineRule="auto"/>
+              <w:jc w:val="both"/>
+            </w:pPr>
+            <w:r>
+              <w:t>Input/Output</w:t>
+            </w:r>
+          </w:p>
+        </w:tc>
+        <w:tc>
+          <w:tcPr>
+            <w:tcW w:w="0" w:type="auto"/>
+            <w:hideMark/>
+          </w:tcPr>
+          <w:p>
+            <w:pPr>
+              <w:spacing w:after="120" w:line="300" w:lineRule="auto"/>
+              <w:ind w:left="29" w:hanging="29"/>
+              <w:jc w:val="both"/>
+              <w:rPr>
+                <w:lang w:val="vi-VN"/>
+              </w:rPr>
+            </w:pPr>
+            <w:r>
+              <w:t>- Input: Thao tác nhấp chọn các nút chức năng trên menu sidebar bên trái.</w:t>
+            </w:r>
+          </w:p>
+          <w:p>
+            <w:pPr>
+              <w:spacing w:after="120" w:line="300" w:lineRule="auto"/>
+              <w:ind w:left="29" w:hanging="29"/>
+              <w:jc w:val="both"/>
+              <w:rPr>
+                <w:lang w:val="vi-VN"/>
+              </w:rPr>
+            </w:pPr>
+            <w:r>
+              <w:rPr>
+                <w:lang w:val="vi-VN"/>
+              </w:rPr>
+              <w:t>- Output: Đổi trạng thái nút bấm (nền đen/trắng), đổi tiêu đề Header và nạp Form con tương ứng vào Panel Desktop.</w:t>
+            </w:r>
+          </w:p>
+        </w:tc>
+      </w:tr>
+      <w:tr>
+        <w:tc>
+          <w:tcPr>
+            <w:tcW w:w="0" w:type="auto"/>
+            <w:hideMark/>
+          </w:tcPr>
+          <w:p>
+            <w:pPr>
+              <w:spacing w:after="120" w:line="300" w:lineRule="auto"/>
+              <w:jc w:val="both"/>
+            </w:pPr>
+            <w:r>
+              <w:t>Kịch bản/Validation</w:t>
+            </w:r>
+          </w:p>
+        </w:tc>
+        <w:tc>
+          <w:tcPr>
+            <w:tcW w:w="0" w:type="auto"/>
+            <w:hideMark/>
+          </w:tcPr>
+          <w:p>
+            <w:pPr>
+              <w:spacing w:after="120" w:line="300" w:lineRule="auto"/>
+              <w:ind w:left="29" w:hanging="29"/>
+              <w:jc w:val="both"/>
+            </w:pPr>
+            <w:r>
+              <w:t>Khởi tạo kết nối CSDL khi Load; Đảm bảo tại một thời điểm chỉ mở 1 Form con; Tự động đóng Form con cũ khi chuyển tab; Cập nhật style nút Active/Inactive kiểu Excel.</w:t>
+            </w:r>
+          </w:p>
+        </w:tc>
+      </w:tr>
+    </w:tbl>
     <w:p>
       <w:pPr>
         <w:spacing w:after="120" w:line="300" w:lineRule="auto"/>
@@ -2337,14 +2642,593 @@
           <w:lang w:val="vi-VN"/>
         </w:rPr>
       </w:pPr>
-      <w:r>
+    </w:p>
+    <w:tbl>
+      <w:tblPr>
+        <w:tblStyle w:val="TableGrid"/>
+        <w:tblW w:w="0" w:type="auto"/>
+        <w:tblLook w:val="04A0" w:firstRow="1" w:lastRow="0" w:firstColumn="1" w:lastColumn="0" w:noHBand="0" w:noVBand="1"/>
+      </w:tblPr>
+      <w:tblGrid>
+        <w:gridCol w:w="2589"/>
+        <w:gridCol w:w="1016"/>
+        <w:gridCol w:w="5739"/>
+      </w:tblGrid>
+      <w:tr>
+        <w:tc>
+          <w:tcPr>
+            <w:tcW w:w="0" w:type="auto"/>
+            <w:hideMark/>
+          </w:tcPr>
+          <w:p>
+            <w:pPr>
+              <w:spacing w:after="120" w:line="300" w:lineRule="auto"/>
+              <w:ind w:left="504" w:hanging="504"/>
+              <w:jc w:val="both"/>
+              <w:rPr>
+                <w:b/>
+                <w:bCs/>
+              </w:rPr>
+            </w:pPr>
+            <w:r>
+              <w:rPr>
+                <w:b/>
+                <w:bCs/>
+              </w:rPr>
+              <w:t>(Name)</w:t>
+            </w:r>
+          </w:p>
+        </w:tc>
+        <w:tc>
+          <w:tcPr>
+            <w:tcW w:w="0" w:type="auto"/>
+            <w:hideMark/>
+          </w:tcPr>
+          <w:p>
+            <w:pPr>
+              <w:spacing w:after="120" w:line="300" w:lineRule="auto"/>
+              <w:ind w:left="504" w:hanging="504"/>
+              <w:jc w:val="both"/>
+              <w:rPr>
+                <w:b/>
+                <w:bCs/>
+              </w:rPr>
+            </w:pPr>
+            <w:r>
+              <w:rPr>
+                <w:b/>
+                <w:bCs/>
+              </w:rPr>
+              <w:t>Control</w:t>
+            </w:r>
+          </w:p>
+        </w:tc>
+        <w:tc>
+          <w:tcPr>
+            <w:tcW w:w="0" w:type="auto"/>
+            <w:hideMark/>
+          </w:tcPr>
+          <w:p>
+            <w:pPr>
+              <w:spacing w:after="120" w:line="300" w:lineRule="auto"/>
+              <w:ind w:left="504" w:hanging="504"/>
+              <w:jc w:val="both"/>
+              <w:rPr>
+                <w:b/>
+                <w:bCs/>
+              </w:rPr>
+            </w:pPr>
+            <w:r>
+              <w:rPr>
+                <w:b/>
+                <w:bCs/>
+              </w:rPr>
+              <w:t>Ý nghĩa</w:t>
+            </w:r>
+          </w:p>
+        </w:tc>
+      </w:tr>
+      <w:tr>
+        <w:tc>
+          <w:tcPr>
+            <w:tcW w:w="0" w:type="auto"/>
+            <w:hideMark/>
+          </w:tcPr>
+          <w:p>
+            <w:pPr>
+              <w:spacing w:after="120" w:line="300" w:lineRule="auto"/>
+              <w:ind w:left="504" w:hanging="504"/>
+              <w:jc w:val="both"/>
+            </w:pPr>
+            <w:r>
+              <w:t>pnlSidebar</w:t>
+            </w:r>
+          </w:p>
+        </w:tc>
+        <w:tc>
+          <w:tcPr>
+            <w:tcW w:w="0" w:type="auto"/>
+            <w:hideMark/>
+          </w:tcPr>
+          <w:p>
+            <w:pPr>
+              <w:spacing w:after="120" w:line="300" w:lineRule="auto"/>
+              <w:ind w:left="504" w:hanging="504"/>
+              <w:jc w:val="both"/>
+            </w:pPr>
+            <w:r>
+              <w:t>Panel</w:t>
+            </w:r>
+          </w:p>
+        </w:tc>
+        <w:tc>
+          <w:tcPr>
+            <w:tcW w:w="0" w:type="auto"/>
+            <w:hideMark/>
+          </w:tcPr>
+          <w:p>
+            <w:pPr>
+              <w:spacing w:after="120" w:line="300" w:lineRule="auto"/>
+              <w:jc w:val="both"/>
+            </w:pPr>
+            <w:r>
+              <w:t>Thanh điều hướng bên trái chứa logo thương hiệu và các nút menu chức năng.</w:t>
+            </w:r>
+          </w:p>
+        </w:tc>
+      </w:tr>
+      <w:tr>
+        <w:tc>
+          <w:tcPr>
+            <w:tcW w:w="0" w:type="auto"/>
+            <w:hideMark/>
+          </w:tcPr>
+          <w:p>
+            <w:pPr>
+              <w:spacing w:after="120" w:line="300" w:lineRule="auto"/>
+              <w:ind w:left="504" w:hanging="504"/>
+              <w:jc w:val="both"/>
+            </w:pPr>
+            <w:r>
+              <w:t>pnlLogo</w:t>
+            </w:r>
+          </w:p>
+        </w:tc>
+        <w:tc>
+          <w:tcPr>
+            <w:tcW w:w="0" w:type="auto"/>
+            <w:hideMark/>
+          </w:tcPr>
+          <w:p>
+            <w:pPr>
+              <w:spacing w:after="120" w:line="300" w:lineRule="auto"/>
+              <w:ind w:left="504" w:hanging="504"/>
+              <w:jc w:val="both"/>
+            </w:pPr>
+            <w:r>
+              <w:t>Panel</w:t>
+            </w:r>
+          </w:p>
+        </w:tc>
+        <w:tc>
+          <w:tcPr>
+            <w:tcW w:w="0" w:type="auto"/>
+            <w:hideMark/>
+          </w:tcPr>
+          <w:p>
+            <w:pPr>
+              <w:spacing w:after="120" w:line="300" w:lineRule="auto"/>
+              <w:jc w:val="both"/>
+            </w:pPr>
+            <w:r>
+              <w:t>Vùng chứa thương hiệu công ty ở góc trên cùng bên trái (màu nền đen).</w:t>
+            </w:r>
+          </w:p>
+        </w:tc>
+      </w:tr>
+      <w:tr>
+        <w:tc>
+          <w:tcPr>
+            <w:tcW w:w="0" w:type="auto"/>
+            <w:hideMark/>
+          </w:tcPr>
+          <w:p>
+            <w:pPr>
+              <w:spacing w:after="120" w:line="300" w:lineRule="auto"/>
+              <w:ind w:left="504" w:hanging="504"/>
+              <w:jc w:val="both"/>
+            </w:pPr>
+            <w:r>
+              <w:t>lblBrandName</w:t>
+            </w:r>
+          </w:p>
+        </w:tc>
+        <w:tc>
+          <w:tcPr>
+            <w:tcW w:w="0" w:type="auto"/>
+            <w:hideMark/>
+          </w:tcPr>
+          <w:p>
+            <w:pPr>
+              <w:spacing w:after="120" w:line="300" w:lineRule="auto"/>
+              <w:ind w:left="504" w:hanging="504"/>
+              <w:jc w:val="both"/>
+            </w:pPr>
+            <w:r>
+              <w:t>Label</w:t>
+            </w:r>
+          </w:p>
+        </w:tc>
+        <w:tc>
+          <w:tcPr>
+            <w:tcW w:w="0" w:type="auto"/>
+            <w:hideMark/>
+          </w:tcPr>
+          <w:p>
+            <w:pPr>
+              <w:spacing w:after="120" w:line="300" w:lineRule="auto"/>
+              <w:jc w:val="both"/>
+            </w:pPr>
+            <w:r>
+              <w:t>Nhãn hiển thị tên công ty "VĂN HÓA VIỆT TRAVEL" (chữ trắng).</w:t>
+            </w:r>
+          </w:p>
+        </w:tc>
+      </w:tr>
+      <w:tr>
+        <w:tc>
+          <w:tcPr>
+            <w:tcW w:w="0" w:type="auto"/>
+            <w:hideMark/>
+          </w:tcPr>
+          <w:p>
+            <w:pPr>
+              <w:spacing w:after="120" w:line="300" w:lineRule="auto"/>
+              <w:ind w:left="504" w:hanging="504"/>
+              <w:jc w:val="both"/>
+            </w:pPr>
+            <w:r>
+              <w:t>btnDangKyTour</w:t>
+            </w:r>
+          </w:p>
+        </w:tc>
+        <w:tc>
+          <w:tcPr>
+            <w:tcW w:w="0" w:type="auto"/>
+            <w:hideMark/>
+          </w:tcPr>
+          <w:p>
+            <w:pPr>
+              <w:spacing w:after="120" w:line="300" w:lineRule="auto"/>
+              <w:ind w:left="504" w:hanging="504"/>
+              <w:jc w:val="both"/>
+            </w:pPr>
+            <w:r>
+              <w:t>Button</w:t>
+            </w:r>
+          </w:p>
+        </w:tc>
+        <w:tc>
+          <w:tcPr>
+            <w:tcW w:w="0" w:type="auto"/>
+            <w:hideMark/>
+          </w:tcPr>
+          <w:p>
+            <w:pPr>
+              <w:spacing w:after="120" w:line="300" w:lineRule="auto"/>
+              <w:jc w:val="both"/>
+            </w:pPr>
+            <w:r>
+              <w:t>Nút chuyển đến chức năng "1. Đăng ký Tour" (FrmDangKyTour).</w:t>
+            </w:r>
+          </w:p>
+        </w:tc>
+      </w:tr>
+      <w:tr>
+        <w:tc>
+          <w:tcPr>
+            <w:tcW w:w="0" w:type="auto"/>
+            <w:hideMark/>
+          </w:tcPr>
+          <w:p>
+            <w:pPr>
+              <w:spacing w:after="120" w:line="300" w:lineRule="auto"/>
+              <w:ind w:left="504" w:hanging="504"/>
+              <w:jc w:val="both"/>
+            </w:pPr>
+            <w:r>
+              <w:t>btnDieuHanhQuyetToan</w:t>
+            </w:r>
+          </w:p>
+        </w:tc>
+        <w:tc>
+          <w:tcPr>
+            <w:tcW w:w="0" w:type="auto"/>
+            <w:hideMark/>
+          </w:tcPr>
+          <w:p>
+            <w:pPr>
+              <w:spacing w:after="120" w:line="300" w:lineRule="auto"/>
+              <w:ind w:left="504" w:hanging="504"/>
+              <w:jc w:val="both"/>
+            </w:pPr>
+            <w:r>
+              <w:t>Button</w:t>
+            </w:r>
+          </w:p>
+        </w:tc>
+        <w:tc>
+          <w:tcPr>
+            <w:tcW w:w="0" w:type="auto"/>
+            <w:hideMark/>
+          </w:tcPr>
+          <w:p>
+            <w:pPr>
+              <w:spacing w:after="120" w:line="300" w:lineRule="auto"/>
+              <w:jc w:val="both"/>
+            </w:pPr>
+            <w:r>
+              <w:t>Nút chuyển đến chức năng "2. Điều hành &amp; Quyết toán" (FrmDieuHanhVaQuyetToan).</w:t>
+            </w:r>
+          </w:p>
+        </w:tc>
+      </w:tr>
+      <w:tr>
+        <w:tc>
+          <w:tcPr>
+            <w:tcW w:w="0" w:type="auto"/>
+            <w:hideMark/>
+          </w:tcPr>
+          <w:p>
+            <w:pPr>
+              <w:spacing w:after="120" w:line="300" w:lineRule="auto"/>
+              <w:ind w:left="504" w:hanging="504"/>
+              <w:jc w:val="both"/>
+            </w:pPr>
+            <w:r>
+              <w:t>btnKhaoSat</w:t>
+            </w:r>
+          </w:p>
+        </w:tc>
+        <w:tc>
+          <w:tcPr>
+            <w:tcW w:w="0" w:type="auto"/>
+            <w:hideMark/>
+          </w:tcPr>
+          <w:p>
+            <w:pPr>
+              <w:spacing w:after="120" w:line="300" w:lineRule="auto"/>
+              <w:ind w:left="504" w:hanging="504"/>
+              <w:jc w:val="both"/>
+            </w:pPr>
+            <w:r>
+              <w:t>Button</w:t>
+            </w:r>
+          </w:p>
+        </w:tc>
+        <w:tc>
+          <w:tcPr>
+            <w:tcW w:w="0" w:type="auto"/>
+            <w:hideMark/>
+          </w:tcPr>
+          <w:p>
+            <w:pPr>
+              <w:spacing w:after="120" w:line="300" w:lineRule="auto"/>
+              <w:jc w:val="both"/>
+            </w:pPr>
+            <w:r>
+              <w:t>Nút chuyển đến chức năng "3. Khảo sát chất lượng" (FrmKhaoSatTour).</w:t>
+            </w:r>
+          </w:p>
+        </w:tc>
+      </w:tr>
+      <w:tr>
+        <w:tc>
+          <w:tcPr>
+            <w:tcW w:w="0" w:type="auto"/>
+            <w:hideMark/>
+          </w:tcPr>
+          <w:p>
+            <w:pPr>
+              <w:spacing w:after="120" w:line="300" w:lineRule="auto"/>
+              <w:ind w:left="504" w:hanging="504"/>
+              <w:jc w:val="both"/>
+            </w:pPr>
+            <w:r>
+              <w:t>pnlHeader</w:t>
+            </w:r>
+          </w:p>
+        </w:tc>
+        <w:tc>
+          <w:tcPr>
+            <w:tcW w:w="0" w:type="auto"/>
+            <w:hideMark/>
+          </w:tcPr>
+          <w:p>
+            <w:pPr>
+              <w:spacing w:after="120" w:line="300" w:lineRule="auto"/>
+              <w:ind w:left="504" w:hanging="504"/>
+              <w:jc w:val="both"/>
+            </w:pPr>
+            <w:r>
+              <w:t>Panel</w:t>
+            </w:r>
+          </w:p>
+        </w:tc>
+        <w:tc>
+          <w:tcPr>
+            <w:tcW w:w="0" w:type="auto"/>
+            <w:hideMark/>
+          </w:tcPr>
+          <w:p>
+            <w:pPr>
+              <w:spacing w:after="120" w:line="300" w:lineRule="auto"/>
+              <w:jc w:val="both"/>
+            </w:pPr>
+            <w:r>
+              <w:t>Thanh tiêu đề trên cùng chứa tên màn hình chức năng đang mở.</w:t>
+            </w:r>
+          </w:p>
+        </w:tc>
+      </w:tr>
+      <w:tr>
+        <w:tc>
+          <w:tcPr>
+            <w:tcW w:w="0" w:type="auto"/>
+            <w:hideMark/>
+          </w:tcPr>
+          <w:p>
+            <w:pPr>
+              <w:spacing w:after="120" w:line="300" w:lineRule="auto"/>
+              <w:ind w:left="504" w:hanging="504"/>
+              <w:jc w:val="both"/>
+            </w:pPr>
+            <w:r>
+              <w:t>lblTitle</w:t>
+            </w:r>
+          </w:p>
+        </w:tc>
+        <w:tc>
+          <w:tcPr>
+            <w:tcW w:w="0" w:type="auto"/>
+            <w:hideMark/>
+          </w:tcPr>
+          <w:p>
+            <w:pPr>
+              <w:spacing w:after="120" w:line="300" w:lineRule="auto"/>
+              <w:ind w:left="504" w:hanging="504"/>
+              <w:jc w:val="both"/>
+            </w:pPr>
+            <w:r>
+              <w:t>Label</w:t>
+            </w:r>
+          </w:p>
+        </w:tc>
+        <w:tc>
+          <w:tcPr>
+            <w:tcW w:w="0" w:type="auto"/>
+            <w:hideMark/>
+          </w:tcPr>
+          <w:p>
+            <w:pPr>
+              <w:spacing w:after="120" w:line="300" w:lineRule="auto"/>
+              <w:jc w:val="both"/>
+            </w:pPr>
+            <w:r>
+              <w:t>Nhãn hiển thị tiêu đề trang hiện tại (Mặc định: "TRANG CHỦ").</w:t>
+            </w:r>
+          </w:p>
+        </w:tc>
+      </w:tr>
+      <w:tr>
+        <w:tc>
+          <w:tcPr>
+            <w:tcW w:w="0" w:type="auto"/>
+            <w:hideMark/>
+          </w:tcPr>
+          <w:p>
+            <w:pPr>
+              <w:spacing w:after="120" w:line="300" w:lineRule="auto"/>
+              <w:ind w:left="504" w:hanging="504"/>
+              <w:jc w:val="both"/>
+            </w:pPr>
+            <w:r>
+              <w:t>pnlDesktop</w:t>
+            </w:r>
+          </w:p>
+        </w:tc>
+        <w:tc>
+          <w:tcPr>
+            <w:tcW w:w="0" w:type="auto"/>
+            <w:hideMark/>
+          </w:tcPr>
+          <w:p>
+            <w:pPr>
+              <w:spacing w:after="120" w:line="300" w:lineRule="auto"/>
+              <w:ind w:left="504" w:hanging="504"/>
+              <w:jc w:val="both"/>
+            </w:pPr>
+            <w:r>
+              <w:t>Panel</w:t>
+            </w:r>
+          </w:p>
+        </w:tc>
+        <w:tc>
+          <w:tcPr>
+            <w:tcW w:w="0" w:type="auto"/>
+            <w:hideMark/>
+          </w:tcPr>
+          <w:p>
+            <w:pPr>
+              <w:spacing w:after="120" w:line="300" w:lineRule="auto"/>
+              <w:jc w:val="both"/>
+            </w:pPr>
+            <w:r>
+              <w:t>Vùng chứa trung tâm để nhúng và hiển thị các Form con (activeForm).</w:t>
+            </w:r>
+          </w:p>
+        </w:tc>
+      </w:tr>
+      <w:tr>
+        <w:tc>
+          <w:tcPr>
+            <w:tcW w:w="0" w:type="auto"/>
+            <w:hideMark/>
+          </w:tcPr>
+          <w:p>
+            <w:pPr>
+              <w:spacing w:after="120" w:line="300" w:lineRule="auto"/>
+              <w:ind w:left="504" w:hanging="504"/>
+              <w:jc w:val="both"/>
+            </w:pPr>
+            <w:r>
+              <w:t>lblWelcome</w:t>
+            </w:r>
+          </w:p>
+        </w:tc>
+        <w:tc>
+          <w:tcPr>
+            <w:tcW w:w="0" w:type="auto"/>
+            <w:hideMark/>
+          </w:tcPr>
+          <w:p>
+            <w:pPr>
+              <w:spacing w:after="120" w:line="300" w:lineRule="auto"/>
+              <w:ind w:left="504" w:hanging="504"/>
+              <w:jc w:val="both"/>
+            </w:pPr>
+            <w:r>
+              <w:t>Label</w:t>
+            </w:r>
+          </w:p>
+        </w:tc>
+        <w:tc>
+          <w:tcPr>
+            <w:tcW w:w="0" w:type="auto"/>
+            <w:hideMark/>
+          </w:tcPr>
+          <w:p>
+            <w:pPr>
+              <w:spacing w:after="120" w:line="300" w:lineRule="auto"/>
+              <w:jc w:val="both"/>
+            </w:pPr>
+            <w:r>
+              <w:t>Nhãn dòng chữ hướng dẫn mặc định khi chưa mở chức năng nào.</w:t>
+            </w:r>
+          </w:p>
+        </w:tc>
+      </w:tr>
+    </w:tbl>
+    <w:p>
+      <w:pPr>
+        <w:spacing w:after="120" w:line="300" w:lineRule="auto"/>
+        <w:ind w:left="504" w:hanging="504"/>
+        <w:jc w:val="both"/>
         <w:rPr>
           <w:b/>
           <w:bCs/>
-          <w:lang w:val="vi-VN"/>
         </w:rPr>
-        <w:t>FrmDangKyTour</w:t>
-      </w:r>
+      </w:pPr>
     </w:p>
     <w:p>
       <w:pPr>
@@ -2359,6 +3243,27 @@
       </w:pPr>
       <w:r>
         <w:rPr>
+          <w:b/>
+          <w:bCs/>
+          <w:lang w:val="vi-VN"/>
+        </w:rPr>
+        <w:t>FrmDangKyTour</w:t>
+      </w:r>
+    </w:p>
+    <w:p>
+      <w:pPr>
+        <w:spacing w:after="120" w:line="300" w:lineRule="auto"/>
+        <w:ind w:left="504" w:hanging="504"/>
+        <w:jc w:val="both"/>
+        <w:rPr>
+          <w:b/>
+          <w:bCs/>
+          <w:lang w:val="vi-VN"/>
+        </w:rPr>
+      </w:pPr>
+      <w:r>
+        <w:rPr>
+          <w:noProof/>
           <w:lang w:val="vi-VN"/>
         </w:rPr>
         <w:lastRenderedPageBreak/>
@@ -2398,13 +3303,6 @@
           </wp:inline>
         </w:drawing>
       </w:r>
-      <w:r>
-        <w:rPr>
-          <w:b/>
-          <w:bCs/>
-        </w:rPr>
-        <w:t>FrmDieuHanhVaQuyetToan</w:t>
-      </w:r>
     </w:p>
     <w:p>
       <w:pPr>
@@ -2419,106 +3317,7 @@
         <w:rPr>
           <w:lang w:val="vi-VN"/>
         </w:rPr>
-        <w:t>Gộp các thao tác hậu cần và tài chính của Nhân viên (Điều hành &amp; Kế toán) vào chung một Form quản lý trạng thái chuyến đi:</w:t>
-      </w:r>
-    </w:p>
-    <w:p>
-      <w:pPr>
-        <w:numPr>
-          <w:ilvl w:val="0"/>
-          <w:numId w:val="17"/>
-        </w:numPr>
-        <w:spacing w:after="120" w:line="300" w:lineRule="auto"/>
-        <w:jc w:val="both"/>
-        <w:rPr>
-          <w:lang w:val="vi-VN"/>
-        </w:rPr>
-      </w:pPr>
-      <w:r>
-        <w:rPr>
-          <w:lang w:val="vi-VN"/>
-        </w:rPr>
-        <w:t xml:space="preserve">Phân công Hướng dẫn viên: Chọn chuyến đi/đoàn </w:t>
-      </w:r>
-      <m:oMath>
-        <m:r>
-          <w:rPr>
-            <w:rFonts w:ascii="Cambria Math" w:hAnsi="Cambria Math"/>
-            <w:lang w:val="vi-VN"/>
-          </w:rPr>
-          <m:t>→</m:t>
-        </m:r>
-      </m:oMath>
-      <w:r>
-        <w:rPr>
-          <w:lang w:val="vi-VN"/>
-        </w:rPr>
-        <w:t xml:space="preserve"> Chọn HDV </w:t>
-      </w:r>
-      <m:oMath>
-        <m:r>
-          <w:rPr>
-            <w:rFonts w:ascii="Cambria Math" w:hAnsi="Cambria Math"/>
-            <w:lang w:val="vi-VN"/>
-          </w:rPr>
-          <m:t>→</m:t>
-        </m:r>
-      </m:oMath>
-      <w:r>
-        <w:rPr>
-          <w:lang w:val="vi-VN"/>
-        </w:rPr>
-        <w:t xml:space="preserve"> Hệ thống tự kiểm tra, nếu trùng lịch sẽ hiển thị cảnh báo đỏ yêu cầu chọn lại (Flow 4a).</w:t>
-      </w:r>
-    </w:p>
-    <w:p>
-      <w:pPr>
-        <w:numPr>
-          <w:ilvl w:val="0"/>
-          <w:numId w:val="17"/>
-        </w:numPr>
-        <w:spacing w:after="120" w:line="300" w:lineRule="auto"/>
-        <w:jc w:val="both"/>
-        <w:rPr>
-          <w:b/>
-          <w:bCs/>
-          <w:lang w:val="vi-VN"/>
-        </w:rPr>
-      </w:pPr>
-      <w:r>
-        <w:rPr>
-          <w:lang w:val="vi-VN"/>
-        </w:rPr>
-        <w:t xml:space="preserve">Quyết toán Tour đoàn: Khi chuyến đi hoàn tất, Nhân viên chọn lại đoàn </w:t>
-      </w:r>
-      <m:oMath>
-        <m:r>
-          <w:rPr>
-            <w:rFonts w:ascii="Cambria Math" w:hAnsi="Cambria Math"/>
-            <w:lang w:val="vi-VN"/>
-          </w:rPr>
-          <m:t>→</m:t>
-        </m:r>
-      </m:oMath>
-      <w:r>
-        <w:rPr>
-          <w:lang w:val="vi-VN"/>
-        </w:rPr>
-        <w:t xml:space="preserve"> Nhấn "Quyết toán" để thu</w:t>
-      </w:r>
-      <w:r>
-        <w:rPr>
-          <w:b/>
-          <w:bCs/>
-          <w:lang w:val="vi-VN"/>
-        </w:rPr>
-        <w:t xml:space="preserve"> </w:t>
-      </w:r>
-      <w:r>
-        <w:rPr>
-          <w:lang w:val="vi-VN"/>
-        </w:rPr>
-        <w:t>nốt số tiền còn lại và cập nhật trạng thái kết thúc tour.</w:t>
+        <w:t>Kết nối Database</w:t>
       </w:r>
     </w:p>
     <w:p>
@@ -2536,79 +3335,301 @@
         <w:rPr>
           <w:b/>
           <w:bCs/>
-        </w:rPr>
-        <w:t>FrmKhaoSatTour</w:t>
-      </w:r>
-    </w:p>
-    <w:p>
-      <w:pPr>
-        <w:spacing w:after="120" w:line="300" w:lineRule="auto"/>
-        <w:ind w:left="504" w:hanging="504"/>
-        <w:jc w:val="both"/>
-        <w:rPr>
           <w:lang w:val="vi-VN"/>
         </w:rPr>
-      </w:pPr>
-      <w:r>
-        <w:rPr>
-          <w:lang w:val="vi-VN"/>
-        </w:rPr>
-        <w:t>Giao diện dành cho Khách hàng gửi phản hồi và Nhân viên tổng hợp ý kiến:</w:t>
+        <w:drawing>
+          <wp:inline distT="0" distB="0" distL="0" distR="0" wp14:anchorId="14B9860A" wp14:editId="07EA26F3">
+            <wp:extent cx="5939790" cy="3474720"/>
+            <wp:effectExtent l="0" t="0" r="3810" b="0"/>
+            <wp:docPr id="343718794" name="Picture 1"/>
+            <wp:cNvGraphicFramePr>
+              <a:graphicFrameLocks xmlns:a="http://schemas.openxmlformats.org/drawingml/2006/main" noChangeAspect="1"/>
+            </wp:cNvGraphicFramePr>
+            <a:graphic xmlns:a="http://schemas.openxmlformats.org/drawingml/2006/main">
+              <a:graphicData uri="http://schemas.openxmlformats.org/drawingml/2006/picture">
+                <pic:pic xmlns:pic="http://schemas.openxmlformats.org/drawingml/2006/picture">
+                  <pic:nvPicPr>
+                    <pic:cNvPr id="343718794" name=""/>
+                    <pic:cNvPicPr/>
+                  </pic:nvPicPr>
+                  <pic:blipFill>
+                    <a:blip r:embed="rId15"/>
+                    <a:stretch>
+                      <a:fillRect/>
+                    </a:stretch>
+                  </pic:blipFill>
+                  <pic:spPr>
+                    <a:xfrm>
+                      <a:off x="0" y="0"/>
+                      <a:ext cx="5939790" cy="3474720"/>
+                    </a:xfrm>
+                    <a:prstGeom prst="rect">
+                      <a:avLst/>
+                    </a:prstGeom>
+                  </pic:spPr>
+                </pic:pic>
+              </a:graphicData>
+            </a:graphic>
+          </wp:inline>
+        </w:drawing>
       </w:r>
     </w:p>
-    <w:p>
-      <w:pPr>
-        <w:numPr>
-          <w:ilvl w:val="0"/>
-          <w:numId w:val="18"/>
-        </w:numPr>
-        <w:spacing w:after="120" w:line="300" w:lineRule="auto"/>
-        <w:jc w:val="both"/>
-        <w:rPr>
-          <w:lang w:val="vi-VN"/>
-        </w:rPr>
-      </w:pPr>
-      <w:r>
-        <w:rPr>
-          <w:lang w:val="vi-VN"/>
-        </w:rPr>
-        <w:t xml:space="preserve">Khách hàng chọn tour đã đi </w:t>
-      </w:r>
-      <m:oMath>
-        <m:r>
-          <w:rPr>
-            <w:rFonts w:ascii="Cambria Math" w:hAnsi="Cambria Math"/>
-            <w:lang w:val="vi-VN"/>
-          </w:rPr>
-          <m:t>→</m:t>
-        </m:r>
-      </m:oMath>
-      <w:r>
-        <w:rPr>
-          <w:lang w:val="vi-VN"/>
-        </w:rPr>
-        <w:t xml:space="preserve"> Đánh giá số sao (ratingScore) và ghi nhận xét.</w:t>
-      </w:r>
-    </w:p>
-    <w:p>
-      <w:pPr>
-        <w:numPr>
-          <w:ilvl w:val="0"/>
-          <w:numId w:val="18"/>
-        </w:numPr>
-        <w:spacing w:after="120" w:line="300" w:lineRule="auto"/>
-        <w:jc w:val="both"/>
-        <w:rPr>
-          <w:lang w:val="vi-VN"/>
-        </w:rPr>
-      </w:pPr>
-      <w:r>
-        <w:rPr>
-          <w:lang w:val="vi-VN"/>
-        </w:rPr>
-        <w:t>Tự động đóng trạng thái khảo sát nếu tour đã kết thúc quá thời hạn quy định (Flow 7a).</w:t>
-      </w:r>
-    </w:p>
+    <w:tbl>
+      <w:tblPr>
+        <w:tblStyle w:val="TableGrid"/>
+        <w:tblW w:w="0" w:type="auto"/>
+        <w:tblLook w:val="04A0" w:firstRow="1" w:lastRow="0" w:firstColumn="1" w:lastColumn="0" w:noHBand="0" w:noVBand="1"/>
+      </w:tblPr>
+      <w:tblGrid>
+        <w:gridCol w:w="2114"/>
+        <w:gridCol w:w="7230"/>
+      </w:tblGrid>
+      <w:tr>
+        <w:tc>
+          <w:tcPr>
+            <w:tcW w:w="0" w:type="auto"/>
+            <w:hideMark/>
+          </w:tcPr>
+          <w:p>
+            <w:pPr>
+              <w:spacing w:after="120" w:line="300" w:lineRule="auto"/>
+              <w:ind w:left="422" w:hanging="504"/>
+              <w:jc w:val="both"/>
+              <w:rPr>
+                <w:b/>
+                <w:bCs/>
+              </w:rPr>
+            </w:pPr>
+            <w:r>
+              <w:rPr>
+                <w:b/>
+                <w:bCs/>
+              </w:rPr>
+              <w:t>Thuộc tính</w:t>
+            </w:r>
+          </w:p>
+        </w:tc>
+        <w:tc>
+          <w:tcPr>
+            <w:tcW w:w="0" w:type="auto"/>
+            <w:hideMark/>
+          </w:tcPr>
+          <w:p>
+            <w:pPr>
+              <w:spacing w:after="120" w:line="300" w:lineRule="auto"/>
+              <w:ind w:left="504" w:hanging="504"/>
+              <w:rPr>
+                <w:b/>
+                <w:bCs/>
+              </w:rPr>
+            </w:pPr>
+            <w:r>
+              <w:rPr>
+                <w:b/>
+                <w:bCs/>
+              </w:rPr>
+              <w:t>Thiết kế</w:t>
+            </w:r>
+          </w:p>
+        </w:tc>
+      </w:tr>
+      <w:tr>
+        <w:tc>
+          <w:tcPr>
+            <w:tcW w:w="0" w:type="auto"/>
+            <w:hideMark/>
+          </w:tcPr>
+          <w:p>
+            <w:pPr>
+              <w:spacing w:after="120" w:line="300" w:lineRule="auto"/>
+              <w:ind w:left="422" w:hanging="504"/>
+              <w:jc w:val="both"/>
+            </w:pPr>
+            <w:r>
+              <w:t>Mục đích</w:t>
+            </w:r>
+          </w:p>
+        </w:tc>
+        <w:tc>
+          <w:tcPr>
+            <w:tcW w:w="0" w:type="auto"/>
+            <w:hideMark/>
+          </w:tcPr>
+          <w:p>
+            <w:pPr>
+              <w:spacing w:after="120" w:line="300" w:lineRule="auto"/>
+              <w:ind w:left="25" w:hanging="25"/>
+            </w:pPr>
+            <w:r>
+              <w:t>Đăng ký mua vé tour lẻ (&lt; 12 người) và lập phiếu đăng ký tour đoàn (≥ 12 người), ghi nhận danh sách bảo hiểm và xử lý cọc/hủy tour.</w:t>
+            </w:r>
+          </w:p>
+        </w:tc>
+      </w:tr>
+      <w:tr>
+        <w:tc>
+          <w:tcPr>
+            <w:tcW w:w="0" w:type="auto"/>
+            <w:hideMark/>
+          </w:tcPr>
+          <w:p>
+            <w:pPr>
+              <w:spacing w:after="120" w:line="300" w:lineRule="auto"/>
+              <w:ind w:left="422" w:hanging="504"/>
+              <w:jc w:val="both"/>
+            </w:pPr>
+            <w:r>
+              <w:t>Đối tượng sử dụng</w:t>
+            </w:r>
+          </w:p>
+        </w:tc>
+        <w:tc>
+          <w:tcPr>
+            <w:tcW w:w="0" w:type="auto"/>
+            <w:hideMark/>
+          </w:tcPr>
+          <w:p>
+            <w:pPr>
+              <w:spacing w:after="120" w:line="300" w:lineRule="auto"/>
+              <w:ind w:left="25" w:hanging="25"/>
+            </w:pPr>
+            <w:r>
+              <w:t>Nhân viên bán vé / Tư vấn viên (Staff).</w:t>
+            </w:r>
+          </w:p>
+        </w:tc>
+      </w:tr>
+      <w:tr>
+        <w:tc>
+          <w:tcPr>
+            <w:tcW w:w="0" w:type="auto"/>
+            <w:hideMark/>
+          </w:tcPr>
+          <w:p>
+            <w:pPr>
+              <w:spacing w:after="120" w:line="300" w:lineRule="auto"/>
+              <w:ind w:left="422" w:hanging="504"/>
+              <w:jc w:val="both"/>
+            </w:pPr>
+            <w:r>
+              <w:lastRenderedPageBreak/>
+              <w:t>Đọc/Ghi dữ liệu</w:t>
+            </w:r>
+          </w:p>
+        </w:tc>
+        <w:tc>
+          <w:tcPr>
+            <w:tcW w:w="0" w:type="auto"/>
+            <w:hideMark/>
+          </w:tcPr>
+          <w:p>
+            <w:pPr>
+              <w:spacing w:after="120" w:line="300" w:lineRule="auto"/>
+              <w:ind w:left="25" w:hanging="25"/>
+              <w:rPr>
+                <w:lang w:val="vi-VN"/>
+              </w:rPr>
+            </w:pPr>
+            <w:r>
+              <w:t>- Đọc: Bảng Tour, Customer, User, ChuyenDiLe.</w:t>
+            </w:r>
+          </w:p>
+          <w:p>
+            <w:pPr>
+              <w:spacing w:after="120" w:line="300" w:lineRule="auto"/>
+              <w:ind w:left="25" w:hanging="25"/>
+            </w:pPr>
+            <w:r>
+              <w:t>- Ghi: Bảng User, Customer, VeTourLe, PhieuDangKyDoan, DanhSachBaoHiem, cập nhật availableSlots trong ChuyenDiLe.</w:t>
+            </w:r>
+          </w:p>
+        </w:tc>
+      </w:tr>
+      <w:tr>
+        <w:tc>
+          <w:tcPr>
+            <w:tcW w:w="0" w:type="auto"/>
+            <w:hideMark/>
+          </w:tcPr>
+          <w:p>
+            <w:pPr>
+              <w:spacing w:after="120" w:line="300" w:lineRule="auto"/>
+              <w:ind w:left="422" w:hanging="504"/>
+              <w:jc w:val="both"/>
+            </w:pPr>
+            <w:r>
+              <w:t>Input/Output</w:t>
+            </w:r>
+          </w:p>
+        </w:tc>
+        <w:tc>
+          <w:tcPr>
+            <w:tcW w:w="0" w:type="auto"/>
+            <w:hideMark/>
+          </w:tcPr>
+          <w:p>
+            <w:pPr>
+              <w:spacing w:after="120" w:line="300" w:lineRule="auto"/>
+              <w:ind w:left="25" w:hanging="25"/>
+              <w:rPr>
+                <w:lang w:val="vi-VN"/>
+              </w:rPr>
+            </w:pPr>
+            <w:r>
+              <w:t>- Input: Thông tin khách lẻ (Họ tên, CMND, Tour, Chuyến đi, Điểm đón) hoặc Khách đoàn (Đại diện, Tour, Số lượng, Ngày đi, Điểm đón, Tiền cọc, Danh sách bảo hiểm).</w:t>
+            </w:r>
+          </w:p>
+          <w:p>
+            <w:pPr>
+              <w:spacing w:after="120" w:line="300" w:lineRule="auto"/>
+              <w:ind w:left="25" w:hanging="25"/>
+              <w:rPr>
+                <w:lang w:val="vi-VN"/>
+              </w:rPr>
+            </w:pPr>
+            <w:r>
+              <w:rPr>
+                <w:lang w:val="vi-VN"/>
+              </w:rPr>
+              <w:t>- Output: Thông báo xuất vé thành công, tạo phiếu đoàn thành công, in biên nhận hoặc ghi nhận hủy cọc.</w:t>
+            </w:r>
+          </w:p>
+        </w:tc>
+      </w:tr>
+      <w:tr>
+        <w:tc>
+          <w:tcPr>
+            <w:tcW w:w="0" w:type="auto"/>
+            <w:hideMark/>
+          </w:tcPr>
+          <w:p>
+            <w:pPr>
+              <w:spacing w:after="120" w:line="300" w:lineRule="auto"/>
+              <w:ind w:left="422" w:hanging="504"/>
+              <w:jc w:val="both"/>
+            </w:pPr>
+            <w:r>
+              <w:t>Kịch bản/Validation</w:t>
+            </w:r>
+          </w:p>
+        </w:tc>
+        <w:tc>
+          <w:tcPr>
+            <w:tcW w:w="0" w:type="auto"/>
+            <w:hideMark/>
+          </w:tcPr>
+          <w:p>
+            <w:pPr>
+              <w:spacing w:after="120" w:line="300" w:lineRule="auto"/>
+              <w:ind w:left="25" w:hanging="25"/>
+            </w:pPr>
+            <w:r>
+              <w:t>Bắt buộc nhập đầy đủ thông tin; Tự động tìm/tạo khách mới theo CMND; Kiểm tra số lượng đoàn ≥ 12; Ràng buộc tiền cọc số dương; Ghi nhận mất cọc khi hủy đoàn.</w:t>
+            </w:r>
+          </w:p>
+        </w:tc>
+      </w:tr>
+    </w:tbl>
     <w:p>
       <w:pPr>
         <w:spacing w:after="120" w:line="300" w:lineRule="auto"/>
@@ -2621,8 +3642,3295 @@
         </w:rPr>
       </w:pPr>
     </w:p>
+    <w:tbl>
+      <w:tblPr>
+        <w:tblStyle w:val="TableGrid"/>
+        <w:tblW w:w="0" w:type="auto"/>
+        <w:tblLook w:val="04A0" w:firstRow="1" w:lastRow="0" w:firstColumn="1" w:lastColumn="0" w:noHBand="0" w:noVBand="1"/>
+      </w:tblPr>
+      <w:tblGrid>
+        <w:gridCol w:w="2043"/>
+        <w:gridCol w:w="1936"/>
+        <w:gridCol w:w="5365"/>
+      </w:tblGrid>
+      <w:tr>
+        <w:tc>
+          <w:tcPr>
+            <w:tcW w:w="0" w:type="auto"/>
+            <w:hideMark/>
+          </w:tcPr>
+          <w:p>
+            <w:pPr>
+              <w:spacing w:after="120" w:line="300" w:lineRule="auto"/>
+              <w:ind w:left="504" w:hanging="504"/>
+              <w:jc w:val="both"/>
+              <w:rPr>
+                <w:b/>
+                <w:bCs/>
+              </w:rPr>
+            </w:pPr>
+            <w:r>
+              <w:rPr>
+                <w:b/>
+                <w:bCs/>
+              </w:rPr>
+              <w:t>(Name)</w:t>
+            </w:r>
+          </w:p>
+        </w:tc>
+        <w:tc>
+          <w:tcPr>
+            <w:tcW w:w="0" w:type="auto"/>
+            <w:hideMark/>
+          </w:tcPr>
+          <w:p>
+            <w:pPr>
+              <w:spacing w:after="120" w:line="300" w:lineRule="auto"/>
+              <w:ind w:left="504" w:hanging="504"/>
+              <w:jc w:val="both"/>
+              <w:rPr>
+                <w:b/>
+                <w:bCs/>
+              </w:rPr>
+            </w:pPr>
+            <w:r>
+              <w:rPr>
+                <w:b/>
+                <w:bCs/>
+              </w:rPr>
+              <w:t>Control</w:t>
+            </w:r>
+          </w:p>
+        </w:tc>
+        <w:tc>
+          <w:tcPr>
+            <w:tcW w:w="0" w:type="auto"/>
+            <w:hideMark/>
+          </w:tcPr>
+          <w:p>
+            <w:pPr>
+              <w:spacing w:after="120" w:line="300" w:lineRule="auto"/>
+              <w:ind w:left="504" w:hanging="504"/>
+              <w:jc w:val="both"/>
+              <w:rPr>
+                <w:b/>
+                <w:bCs/>
+              </w:rPr>
+            </w:pPr>
+            <w:r>
+              <w:rPr>
+                <w:b/>
+                <w:bCs/>
+              </w:rPr>
+              <w:t>Ý nghĩa</w:t>
+            </w:r>
+          </w:p>
+        </w:tc>
+      </w:tr>
+      <w:tr>
+        <w:tc>
+          <w:tcPr>
+            <w:tcW w:w="0" w:type="auto"/>
+            <w:hideMark/>
+          </w:tcPr>
+          <w:p>
+            <w:pPr>
+              <w:spacing w:after="120" w:line="300" w:lineRule="auto"/>
+              <w:ind w:left="504" w:hanging="504"/>
+            </w:pPr>
+            <w:r>
+              <w:t>tabControlMain</w:t>
+            </w:r>
+          </w:p>
+        </w:tc>
+        <w:tc>
+          <w:tcPr>
+            <w:tcW w:w="0" w:type="auto"/>
+            <w:hideMark/>
+          </w:tcPr>
+          <w:p>
+            <w:pPr>
+              <w:spacing w:after="120" w:line="300" w:lineRule="auto"/>
+              <w:ind w:left="504" w:hanging="504"/>
+            </w:pPr>
+            <w:r>
+              <w:t>TabControl</w:t>
+            </w:r>
+          </w:p>
+        </w:tc>
+        <w:tc>
+          <w:tcPr>
+            <w:tcW w:w="0" w:type="auto"/>
+            <w:hideMark/>
+          </w:tcPr>
+          <w:p>
+            <w:pPr>
+              <w:spacing w:after="120" w:line="300" w:lineRule="auto"/>
+            </w:pPr>
+            <w:r>
+              <w:t>Quản lý chuyển đổi giữa Tab Đăng ký tour lẻ và Tab Lập phiếu tour đoàn.</w:t>
+            </w:r>
+          </w:p>
+        </w:tc>
+      </w:tr>
+      <w:tr>
+        <w:tc>
+          <w:tcPr>
+            <w:tcW w:w="0" w:type="auto"/>
+            <w:hideMark/>
+          </w:tcPr>
+          <w:p>
+            <w:pPr>
+              <w:spacing w:after="120" w:line="300" w:lineRule="auto"/>
+              <w:ind w:left="504" w:hanging="504"/>
+            </w:pPr>
+            <w:r>
+              <w:t>tabTourLe</w:t>
+            </w:r>
+          </w:p>
+        </w:tc>
+        <w:tc>
+          <w:tcPr>
+            <w:tcW w:w="0" w:type="auto"/>
+            <w:hideMark/>
+          </w:tcPr>
+          <w:p>
+            <w:pPr>
+              <w:spacing w:after="120" w:line="300" w:lineRule="auto"/>
+              <w:ind w:left="504" w:hanging="504"/>
+            </w:pPr>
+            <w:r>
+              <w:t>TabPage</w:t>
+            </w:r>
+          </w:p>
+        </w:tc>
+        <w:tc>
+          <w:tcPr>
+            <w:tcW w:w="0" w:type="auto"/>
+            <w:hideMark/>
+          </w:tcPr>
+          <w:p>
+            <w:pPr>
+              <w:spacing w:after="120" w:line="300" w:lineRule="auto"/>
+            </w:pPr>
+            <w:r>
+              <w:t>Chứa giao diện thao tác bán vé tour lẻ.</w:t>
+            </w:r>
+          </w:p>
+        </w:tc>
+      </w:tr>
+      <w:tr>
+        <w:tc>
+          <w:tcPr>
+            <w:tcW w:w="0" w:type="auto"/>
+            <w:hideMark/>
+          </w:tcPr>
+          <w:p>
+            <w:pPr>
+              <w:spacing w:after="120" w:line="300" w:lineRule="auto"/>
+              <w:ind w:left="504" w:hanging="504"/>
+            </w:pPr>
+            <w:r>
+              <w:t>txtTenKhachLe</w:t>
+            </w:r>
+          </w:p>
+        </w:tc>
+        <w:tc>
+          <w:tcPr>
+            <w:tcW w:w="0" w:type="auto"/>
+            <w:hideMark/>
+          </w:tcPr>
+          <w:p>
+            <w:pPr>
+              <w:spacing w:after="120" w:line="300" w:lineRule="auto"/>
+              <w:ind w:left="504" w:hanging="504"/>
+            </w:pPr>
+            <w:r>
+              <w:t>TextBox</w:t>
+            </w:r>
+          </w:p>
+        </w:tc>
+        <w:tc>
+          <w:tcPr>
+            <w:tcW w:w="0" w:type="auto"/>
+            <w:hideMark/>
+          </w:tcPr>
+          <w:p>
+            <w:pPr>
+              <w:spacing w:after="120" w:line="300" w:lineRule="auto"/>
+            </w:pPr>
+            <w:r>
+              <w:t>Ô nhập họ và tên của khách hàng mua vé lẻ.</w:t>
+            </w:r>
+          </w:p>
+        </w:tc>
+      </w:tr>
+      <w:tr>
+        <w:tc>
+          <w:tcPr>
+            <w:tcW w:w="0" w:type="auto"/>
+            <w:hideMark/>
+          </w:tcPr>
+          <w:p>
+            <w:pPr>
+              <w:spacing w:after="120" w:line="300" w:lineRule="auto"/>
+              <w:ind w:left="504" w:hanging="504"/>
+            </w:pPr>
+            <w:r>
+              <w:t>txtCMNDLe</w:t>
+            </w:r>
+          </w:p>
+        </w:tc>
+        <w:tc>
+          <w:tcPr>
+            <w:tcW w:w="0" w:type="auto"/>
+            <w:hideMark/>
+          </w:tcPr>
+          <w:p>
+            <w:pPr>
+              <w:spacing w:after="120" w:line="300" w:lineRule="auto"/>
+              <w:ind w:left="504" w:hanging="504"/>
+            </w:pPr>
+            <w:r>
+              <w:t>TextBox</w:t>
+            </w:r>
+          </w:p>
+        </w:tc>
+        <w:tc>
+          <w:tcPr>
+            <w:tcW w:w="0" w:type="auto"/>
+            <w:hideMark/>
+          </w:tcPr>
+          <w:p>
+            <w:pPr>
+              <w:spacing w:after="120" w:line="300" w:lineRule="auto"/>
+            </w:pPr>
+            <w:r>
+              <w:t>Ô nhập số CMND/CCCD của khách mua vé lẻ.</w:t>
+            </w:r>
+          </w:p>
+        </w:tc>
+      </w:tr>
+      <w:tr>
+        <w:tc>
+          <w:tcPr>
+            <w:tcW w:w="0" w:type="auto"/>
+            <w:hideMark/>
+          </w:tcPr>
+          <w:p>
+            <w:pPr>
+              <w:spacing w:after="120" w:line="300" w:lineRule="auto"/>
+              <w:ind w:left="504" w:hanging="504"/>
+            </w:pPr>
+            <w:r>
+              <w:t>cboTourLe</w:t>
+            </w:r>
+          </w:p>
+        </w:tc>
+        <w:tc>
+          <w:tcPr>
+            <w:tcW w:w="0" w:type="auto"/>
+            <w:hideMark/>
+          </w:tcPr>
+          <w:p>
+            <w:pPr>
+              <w:spacing w:after="120" w:line="300" w:lineRule="auto"/>
+              <w:ind w:left="504" w:hanging="504"/>
+            </w:pPr>
+            <w:r>
+              <w:t>ComboBox</w:t>
+            </w:r>
+          </w:p>
+        </w:tc>
+        <w:tc>
+          <w:tcPr>
+            <w:tcW w:w="0" w:type="auto"/>
+            <w:hideMark/>
+          </w:tcPr>
+          <w:p>
+            <w:pPr>
+              <w:spacing w:after="120" w:line="300" w:lineRule="auto"/>
+            </w:pPr>
+            <w:r>
+              <w:t>Danh sách chọn Tour du lịch lẻ.</w:t>
+            </w:r>
+          </w:p>
+        </w:tc>
+      </w:tr>
+      <w:tr>
+        <w:tc>
+          <w:tcPr>
+            <w:tcW w:w="0" w:type="auto"/>
+            <w:hideMark/>
+          </w:tcPr>
+          <w:p>
+            <w:pPr>
+              <w:spacing w:after="120" w:line="300" w:lineRule="auto"/>
+              <w:ind w:left="504" w:hanging="504"/>
+            </w:pPr>
+            <w:r>
+              <w:t>cboChuyenLe</w:t>
+            </w:r>
+          </w:p>
+        </w:tc>
+        <w:tc>
+          <w:tcPr>
+            <w:tcW w:w="0" w:type="auto"/>
+            <w:hideMark/>
+          </w:tcPr>
+          <w:p>
+            <w:pPr>
+              <w:spacing w:after="120" w:line="300" w:lineRule="auto"/>
+              <w:ind w:left="504" w:hanging="504"/>
+            </w:pPr>
+            <w:r>
+              <w:t>ComboBox</w:t>
+            </w:r>
+          </w:p>
+        </w:tc>
+        <w:tc>
+          <w:tcPr>
+            <w:tcW w:w="0" w:type="auto"/>
+            <w:hideMark/>
+          </w:tcPr>
+          <w:p>
+            <w:pPr>
+              <w:spacing w:after="120" w:line="300" w:lineRule="auto"/>
+            </w:pPr>
+            <w:r>
+              <w:t>Danh sách chọn chuyến đi lẻ tương ứng còn chỗ.</w:t>
+            </w:r>
+          </w:p>
+        </w:tc>
+      </w:tr>
+      <w:tr>
+        <w:tc>
+          <w:tcPr>
+            <w:tcW w:w="0" w:type="auto"/>
+            <w:hideMark/>
+          </w:tcPr>
+          <w:p>
+            <w:pPr>
+              <w:spacing w:after="120" w:line="300" w:lineRule="auto"/>
+              <w:ind w:left="504" w:hanging="504"/>
+            </w:pPr>
+            <w:r>
+              <w:t>txtDiemDonLe</w:t>
+            </w:r>
+          </w:p>
+        </w:tc>
+        <w:tc>
+          <w:tcPr>
+            <w:tcW w:w="0" w:type="auto"/>
+            <w:hideMark/>
+          </w:tcPr>
+          <w:p>
+            <w:pPr>
+              <w:spacing w:after="120" w:line="300" w:lineRule="auto"/>
+              <w:ind w:left="504" w:hanging="504"/>
+            </w:pPr>
+            <w:r>
+              <w:t>TextBox</w:t>
+            </w:r>
+          </w:p>
+        </w:tc>
+        <w:tc>
+          <w:tcPr>
+            <w:tcW w:w="0" w:type="auto"/>
+            <w:hideMark/>
+          </w:tcPr>
+          <w:p>
+            <w:pPr>
+              <w:spacing w:after="120" w:line="300" w:lineRule="auto"/>
+            </w:pPr>
+            <w:r>
+              <w:t>Ô nhập vị trí điểm đón quy định.</w:t>
+            </w:r>
+          </w:p>
+        </w:tc>
+      </w:tr>
+      <w:tr>
+        <w:tc>
+          <w:tcPr>
+            <w:tcW w:w="0" w:type="auto"/>
+            <w:hideMark/>
+          </w:tcPr>
+          <w:p>
+            <w:pPr>
+              <w:spacing w:after="120" w:line="300" w:lineRule="auto"/>
+              <w:ind w:left="504" w:hanging="504"/>
+            </w:pPr>
+            <w:r>
+              <w:t>txtTongTienLe</w:t>
+            </w:r>
+          </w:p>
+        </w:tc>
+        <w:tc>
+          <w:tcPr>
+            <w:tcW w:w="0" w:type="auto"/>
+            <w:hideMark/>
+          </w:tcPr>
+          <w:p>
+            <w:pPr>
+              <w:spacing w:after="120" w:line="300" w:lineRule="auto"/>
+              <w:ind w:left="504" w:hanging="504"/>
+            </w:pPr>
+            <w:r>
+              <w:t>TextBox</w:t>
+            </w:r>
+          </w:p>
+        </w:tc>
+        <w:tc>
+          <w:tcPr>
+            <w:tcW w:w="0" w:type="auto"/>
+            <w:hideMark/>
+          </w:tcPr>
+          <w:p>
+            <w:pPr>
+              <w:spacing w:after="120" w:line="300" w:lineRule="auto"/>
+            </w:pPr>
+            <w:r>
+              <w:t>Ô hiển thị 100% giá trị tiền vé (ReadOnly).</w:t>
+            </w:r>
+          </w:p>
+        </w:tc>
+      </w:tr>
+      <w:tr>
+        <w:tc>
+          <w:tcPr>
+            <w:tcW w:w="0" w:type="auto"/>
+            <w:hideMark/>
+          </w:tcPr>
+          <w:p>
+            <w:pPr>
+              <w:spacing w:after="120" w:line="300" w:lineRule="auto"/>
+              <w:ind w:left="504" w:hanging="504"/>
+            </w:pPr>
+            <w:r>
+              <w:t>btnXuatVeLe</w:t>
+            </w:r>
+          </w:p>
+        </w:tc>
+        <w:tc>
+          <w:tcPr>
+            <w:tcW w:w="0" w:type="auto"/>
+            <w:hideMark/>
+          </w:tcPr>
+          <w:p>
+            <w:pPr>
+              <w:spacing w:after="120" w:line="300" w:lineRule="auto"/>
+              <w:ind w:left="504" w:hanging="504"/>
+            </w:pPr>
+            <w:r>
+              <w:t>Button</w:t>
+            </w:r>
+          </w:p>
+        </w:tc>
+        <w:tc>
+          <w:tcPr>
+            <w:tcW w:w="0" w:type="auto"/>
+            <w:hideMark/>
+          </w:tcPr>
+          <w:p>
+            <w:pPr>
+              <w:spacing w:after="120" w:line="300" w:lineRule="auto"/>
+            </w:pPr>
+            <w:r>
+              <w:t>Nút kiểm tra dữ liệu, tự lưu thông tin khách và xuất vé lẻ.</w:t>
+            </w:r>
+          </w:p>
+        </w:tc>
+      </w:tr>
+      <w:tr>
+        <w:tc>
+          <w:tcPr>
+            <w:tcW w:w="0" w:type="auto"/>
+            <w:hideMark/>
+          </w:tcPr>
+          <w:p>
+            <w:pPr>
+              <w:spacing w:after="120" w:line="300" w:lineRule="auto"/>
+              <w:ind w:left="504" w:hanging="504"/>
+            </w:pPr>
+            <w:r>
+              <w:t>lblStatusLe</w:t>
+            </w:r>
+          </w:p>
+        </w:tc>
+        <w:tc>
+          <w:tcPr>
+            <w:tcW w:w="0" w:type="auto"/>
+            <w:hideMark/>
+          </w:tcPr>
+          <w:p>
+            <w:pPr>
+              <w:spacing w:after="120" w:line="300" w:lineRule="auto"/>
+              <w:ind w:left="504" w:hanging="504"/>
+            </w:pPr>
+            <w:r>
+              <w:t>Label</w:t>
+            </w:r>
+          </w:p>
+        </w:tc>
+        <w:tc>
+          <w:tcPr>
+            <w:tcW w:w="0" w:type="auto"/>
+            <w:hideMark/>
+          </w:tcPr>
+          <w:p>
+            <w:pPr>
+              <w:spacing w:after="120" w:line="300" w:lineRule="auto"/>
+            </w:pPr>
+            <w:r>
+              <w:t>Nhãn hiển thị thông báo lỗi hoặc trạng thái xuất vé lẻ (chữ đỏ).</w:t>
+            </w:r>
+          </w:p>
+        </w:tc>
+      </w:tr>
+      <w:tr>
+        <w:tc>
+          <w:tcPr>
+            <w:tcW w:w="0" w:type="auto"/>
+            <w:hideMark/>
+          </w:tcPr>
+          <w:p>
+            <w:pPr>
+              <w:spacing w:after="120" w:line="300" w:lineRule="auto"/>
+              <w:ind w:left="504" w:hanging="504"/>
+            </w:pPr>
+            <w:r>
+              <w:t>tabTourDoan</w:t>
+            </w:r>
+          </w:p>
+        </w:tc>
+        <w:tc>
+          <w:tcPr>
+            <w:tcW w:w="0" w:type="auto"/>
+            <w:hideMark/>
+          </w:tcPr>
+          <w:p>
+            <w:pPr>
+              <w:spacing w:after="120" w:line="300" w:lineRule="auto"/>
+              <w:ind w:left="504" w:hanging="504"/>
+            </w:pPr>
+            <w:r>
+              <w:t>TabPage</w:t>
+            </w:r>
+          </w:p>
+        </w:tc>
+        <w:tc>
+          <w:tcPr>
+            <w:tcW w:w="0" w:type="auto"/>
+            <w:hideMark/>
+          </w:tcPr>
+          <w:p>
+            <w:pPr>
+              <w:spacing w:after="120" w:line="300" w:lineRule="auto"/>
+            </w:pPr>
+            <w:r>
+              <w:t>Chứa giao diện lập phiếu tour đoàn.</w:t>
+            </w:r>
+          </w:p>
+        </w:tc>
+      </w:tr>
+      <w:tr>
+        <w:tc>
+          <w:tcPr>
+            <w:tcW w:w="0" w:type="auto"/>
+            <w:hideMark/>
+          </w:tcPr>
+          <w:p>
+            <w:pPr>
+              <w:spacing w:after="120" w:line="300" w:lineRule="auto"/>
+              <w:ind w:left="504" w:hanging="504"/>
+            </w:pPr>
+            <w:r>
+              <w:t>cboKhachDoan</w:t>
+            </w:r>
+          </w:p>
+        </w:tc>
+        <w:tc>
+          <w:tcPr>
+            <w:tcW w:w="0" w:type="auto"/>
+            <w:hideMark/>
+          </w:tcPr>
+          <w:p>
+            <w:pPr>
+              <w:spacing w:after="120" w:line="300" w:lineRule="auto"/>
+              <w:ind w:left="504" w:hanging="504"/>
+            </w:pPr>
+            <w:r>
+              <w:t>ComboBox</w:t>
+            </w:r>
+          </w:p>
+        </w:tc>
+        <w:tc>
+          <w:tcPr>
+            <w:tcW w:w="0" w:type="auto"/>
+            <w:hideMark/>
+          </w:tcPr>
+          <w:p>
+            <w:pPr>
+              <w:spacing w:after="120" w:line="300" w:lineRule="auto"/>
+            </w:pPr>
+            <w:r>
+              <w:t>Danh sách chọn khách hàng làm đại diện đoàn.</w:t>
+            </w:r>
+          </w:p>
+        </w:tc>
+      </w:tr>
+      <w:tr>
+        <w:tc>
+          <w:tcPr>
+            <w:tcW w:w="0" w:type="auto"/>
+            <w:hideMark/>
+          </w:tcPr>
+          <w:p>
+            <w:pPr>
+              <w:spacing w:after="120" w:line="300" w:lineRule="auto"/>
+              <w:ind w:left="504" w:hanging="504"/>
+            </w:pPr>
+            <w:r>
+              <w:t>cboTourDoan</w:t>
+            </w:r>
+          </w:p>
+        </w:tc>
+        <w:tc>
+          <w:tcPr>
+            <w:tcW w:w="0" w:type="auto"/>
+            <w:hideMark/>
+          </w:tcPr>
+          <w:p>
+            <w:pPr>
+              <w:spacing w:after="120" w:line="300" w:lineRule="auto"/>
+              <w:ind w:left="504" w:hanging="504"/>
+            </w:pPr>
+            <w:r>
+              <w:t>ComboBox</w:t>
+            </w:r>
+          </w:p>
+        </w:tc>
+        <w:tc>
+          <w:tcPr>
+            <w:tcW w:w="0" w:type="auto"/>
+            <w:hideMark/>
+          </w:tcPr>
+          <w:p>
+            <w:pPr>
+              <w:spacing w:after="120" w:line="300" w:lineRule="auto"/>
+            </w:pPr>
+            <w:r>
+              <w:t>Danh sách chọn Tour cho đoàn.</w:t>
+            </w:r>
+          </w:p>
+        </w:tc>
+      </w:tr>
+      <w:tr>
+        <w:tc>
+          <w:tcPr>
+            <w:tcW w:w="0" w:type="auto"/>
+            <w:hideMark/>
+          </w:tcPr>
+          <w:p>
+            <w:pPr>
+              <w:spacing w:after="120" w:line="300" w:lineRule="auto"/>
+              <w:ind w:left="504" w:hanging="504"/>
+            </w:pPr>
+            <w:r>
+              <w:t>numSoLuongDoan</w:t>
+            </w:r>
+          </w:p>
+        </w:tc>
+        <w:tc>
+          <w:tcPr>
+            <w:tcW w:w="0" w:type="auto"/>
+            <w:hideMark/>
+          </w:tcPr>
+          <w:p>
+            <w:pPr>
+              <w:spacing w:after="120" w:line="300" w:lineRule="auto"/>
+              <w:ind w:left="504" w:hanging="504"/>
+            </w:pPr>
+            <w:r>
+              <w:t>NumericUpDown</w:t>
+            </w:r>
+          </w:p>
+        </w:tc>
+        <w:tc>
+          <w:tcPr>
+            <w:tcW w:w="0" w:type="auto"/>
+            <w:hideMark/>
+          </w:tcPr>
+          <w:p>
+            <w:pPr>
+              <w:spacing w:after="120" w:line="300" w:lineRule="auto"/>
+            </w:pPr>
+            <w:r>
+              <w:t>Chọn số lượng thành viên đoàn (Mặc định: 12, Min: 1).</w:t>
+            </w:r>
+          </w:p>
+        </w:tc>
+      </w:tr>
+      <w:tr>
+        <w:tc>
+          <w:tcPr>
+            <w:tcW w:w="0" w:type="auto"/>
+            <w:hideMark/>
+          </w:tcPr>
+          <w:p>
+            <w:pPr>
+              <w:spacing w:after="120" w:line="300" w:lineRule="auto"/>
+              <w:ind w:left="504" w:hanging="504"/>
+            </w:pPr>
+            <w:r>
+              <w:t>dtpNgayDiDoan</w:t>
+            </w:r>
+          </w:p>
+        </w:tc>
+        <w:tc>
+          <w:tcPr>
+            <w:tcW w:w="0" w:type="auto"/>
+            <w:hideMark/>
+          </w:tcPr>
+          <w:p>
+            <w:pPr>
+              <w:spacing w:after="120" w:line="300" w:lineRule="auto"/>
+              <w:ind w:left="504" w:hanging="504"/>
+            </w:pPr>
+            <w:r>
+              <w:t>DateTimePicker</w:t>
+            </w:r>
+          </w:p>
+        </w:tc>
+        <w:tc>
+          <w:tcPr>
+            <w:tcW w:w="0" w:type="auto"/>
+            <w:hideMark/>
+          </w:tcPr>
+          <w:p>
+            <w:pPr>
+              <w:spacing w:after="120" w:line="300" w:lineRule="auto"/>
+            </w:pPr>
+            <w:r>
+              <w:t>Chọn ngày khởi hành theo yêu cầu của đoàn.</w:t>
+            </w:r>
+          </w:p>
+        </w:tc>
+      </w:tr>
+      <w:tr>
+        <w:tc>
+          <w:tcPr>
+            <w:tcW w:w="0" w:type="auto"/>
+            <w:hideMark/>
+          </w:tcPr>
+          <w:p>
+            <w:pPr>
+              <w:spacing w:after="120" w:line="300" w:lineRule="auto"/>
+              <w:ind w:left="504" w:hanging="504"/>
+            </w:pPr>
+            <w:r>
+              <w:t>txtDiemDonDoan</w:t>
+            </w:r>
+          </w:p>
+        </w:tc>
+        <w:tc>
+          <w:tcPr>
+            <w:tcW w:w="0" w:type="auto"/>
+            <w:hideMark/>
+          </w:tcPr>
+          <w:p>
+            <w:pPr>
+              <w:spacing w:after="120" w:line="300" w:lineRule="auto"/>
+              <w:ind w:left="504" w:hanging="504"/>
+            </w:pPr>
+            <w:r>
+              <w:t>TextBox</w:t>
+            </w:r>
+          </w:p>
+        </w:tc>
+        <w:tc>
+          <w:tcPr>
+            <w:tcW w:w="0" w:type="auto"/>
+            <w:hideMark/>
+          </w:tcPr>
+          <w:p>
+            <w:pPr>
+              <w:spacing w:after="120" w:line="300" w:lineRule="auto"/>
+            </w:pPr>
+            <w:r>
+              <w:t>Ô nhập yêu cầu vị trí điểm đón đoàn.</w:t>
+            </w:r>
+          </w:p>
+        </w:tc>
+      </w:tr>
+      <w:tr>
+        <w:tc>
+          <w:tcPr>
+            <w:tcW w:w="0" w:type="auto"/>
+            <w:hideMark/>
+          </w:tcPr>
+          <w:p>
+            <w:pPr>
+              <w:spacing w:after="120" w:line="300" w:lineRule="auto"/>
+              <w:ind w:left="504" w:hanging="504"/>
+            </w:pPr>
+            <w:r>
+              <w:lastRenderedPageBreak/>
+              <w:t>txtTienCoc</w:t>
+            </w:r>
+          </w:p>
+        </w:tc>
+        <w:tc>
+          <w:tcPr>
+            <w:tcW w:w="0" w:type="auto"/>
+            <w:hideMark/>
+          </w:tcPr>
+          <w:p>
+            <w:pPr>
+              <w:spacing w:after="120" w:line="300" w:lineRule="auto"/>
+              <w:ind w:left="504" w:hanging="504"/>
+            </w:pPr>
+            <w:r>
+              <w:t>TextBox</w:t>
+            </w:r>
+          </w:p>
+        </w:tc>
+        <w:tc>
+          <w:tcPr>
+            <w:tcW w:w="0" w:type="auto"/>
+            <w:hideMark/>
+          </w:tcPr>
+          <w:p>
+            <w:pPr>
+              <w:spacing w:after="120" w:line="300" w:lineRule="auto"/>
+            </w:pPr>
+            <w:r>
+              <w:t>Ô nhập số tiền đặt cọc của tour đoàn.</w:t>
+            </w:r>
+          </w:p>
+        </w:tc>
+      </w:tr>
+      <w:tr>
+        <w:tc>
+          <w:tcPr>
+            <w:tcW w:w="0" w:type="auto"/>
+            <w:hideMark/>
+          </w:tcPr>
+          <w:p>
+            <w:pPr>
+              <w:spacing w:after="120" w:line="300" w:lineRule="auto"/>
+              <w:ind w:left="504" w:hanging="504"/>
+            </w:pPr>
+            <w:r>
+              <w:t>dgvBaoHiem</w:t>
+            </w:r>
+          </w:p>
+        </w:tc>
+        <w:tc>
+          <w:tcPr>
+            <w:tcW w:w="0" w:type="auto"/>
+            <w:hideMark/>
+          </w:tcPr>
+          <w:p>
+            <w:pPr>
+              <w:spacing w:after="120" w:line="300" w:lineRule="auto"/>
+              <w:ind w:left="504" w:hanging="504"/>
+            </w:pPr>
+            <w:r>
+              <w:t>DataGridView</w:t>
+            </w:r>
+          </w:p>
+        </w:tc>
+        <w:tc>
+          <w:tcPr>
+            <w:tcW w:w="0" w:type="auto"/>
+            <w:hideMark/>
+          </w:tcPr>
+          <w:p>
+            <w:pPr>
+              <w:spacing w:after="120" w:line="300" w:lineRule="auto"/>
+            </w:pPr>
+            <w:r>
+              <w:t>Bảng nhập danh sách thành viên đoàn và mã bảo hiểm du lịch.</w:t>
+            </w:r>
+          </w:p>
+        </w:tc>
+      </w:tr>
+      <w:tr>
+        <w:tc>
+          <w:tcPr>
+            <w:tcW w:w="0" w:type="auto"/>
+            <w:hideMark/>
+          </w:tcPr>
+          <w:p>
+            <w:pPr>
+              <w:spacing w:after="120" w:line="300" w:lineRule="auto"/>
+              <w:ind w:left="504" w:hanging="504"/>
+            </w:pPr>
+            <w:r>
+              <w:t>btnTaoPhieuDoan</w:t>
+            </w:r>
+          </w:p>
+        </w:tc>
+        <w:tc>
+          <w:tcPr>
+            <w:tcW w:w="0" w:type="auto"/>
+            <w:hideMark/>
+          </w:tcPr>
+          <w:p>
+            <w:pPr>
+              <w:spacing w:after="120" w:line="300" w:lineRule="auto"/>
+              <w:ind w:left="504" w:hanging="504"/>
+            </w:pPr>
+            <w:r>
+              <w:t>Button</w:t>
+            </w:r>
+          </w:p>
+        </w:tc>
+        <w:tc>
+          <w:tcPr>
+            <w:tcW w:w="0" w:type="auto"/>
+            <w:hideMark/>
+          </w:tcPr>
+          <w:p>
+            <w:pPr>
+              <w:spacing w:after="120" w:line="300" w:lineRule="auto"/>
+            </w:pPr>
+            <w:r>
+              <w:t>Nút tạo phiếu đăng ký đoàn và lưu thông tin bảo hiểm.</w:t>
+            </w:r>
+          </w:p>
+        </w:tc>
+      </w:tr>
+      <w:tr>
+        <w:tc>
+          <w:tcPr>
+            <w:tcW w:w="0" w:type="auto"/>
+            <w:hideMark/>
+          </w:tcPr>
+          <w:p>
+            <w:pPr>
+              <w:spacing w:after="120" w:line="300" w:lineRule="auto"/>
+              <w:ind w:left="504" w:hanging="504"/>
+            </w:pPr>
+            <w:r>
+              <w:t>btnHuyDangKy</w:t>
+            </w:r>
+          </w:p>
+        </w:tc>
+        <w:tc>
+          <w:tcPr>
+            <w:tcW w:w="0" w:type="auto"/>
+            <w:hideMark/>
+          </w:tcPr>
+          <w:p>
+            <w:pPr>
+              <w:spacing w:after="120" w:line="300" w:lineRule="auto"/>
+              <w:ind w:left="504" w:hanging="504"/>
+            </w:pPr>
+            <w:r>
+              <w:t>Button</w:t>
+            </w:r>
+          </w:p>
+        </w:tc>
+        <w:tc>
+          <w:tcPr>
+            <w:tcW w:w="0" w:type="auto"/>
+            <w:hideMark/>
+          </w:tcPr>
+          <w:p>
+            <w:pPr>
+              <w:spacing w:after="120" w:line="300" w:lineRule="auto"/>
+            </w:pPr>
+            <w:r>
+              <w:t>Nút hủy đăng ký tour đoàn và ghi nhận mất cọc.</w:t>
+            </w:r>
+          </w:p>
+        </w:tc>
+      </w:tr>
+      <w:tr>
+        <w:tc>
+          <w:tcPr>
+            <w:tcW w:w="0" w:type="auto"/>
+            <w:hideMark/>
+          </w:tcPr>
+          <w:p>
+            <w:pPr>
+              <w:spacing w:after="120" w:line="300" w:lineRule="auto"/>
+              <w:ind w:left="504" w:hanging="504"/>
+            </w:pPr>
+            <w:r>
+              <w:t>lblErrorDoan</w:t>
+            </w:r>
+          </w:p>
+        </w:tc>
+        <w:tc>
+          <w:tcPr>
+            <w:tcW w:w="0" w:type="auto"/>
+            <w:hideMark/>
+          </w:tcPr>
+          <w:p>
+            <w:pPr>
+              <w:spacing w:after="120" w:line="300" w:lineRule="auto"/>
+              <w:ind w:left="504" w:hanging="504"/>
+            </w:pPr>
+            <w:r>
+              <w:t>Label</w:t>
+            </w:r>
+          </w:p>
+        </w:tc>
+        <w:tc>
+          <w:tcPr>
+            <w:tcW w:w="0" w:type="auto"/>
+            <w:hideMark/>
+          </w:tcPr>
+          <w:p>
+            <w:pPr>
+              <w:spacing w:after="120" w:line="300" w:lineRule="auto"/>
+            </w:pPr>
+            <w:r>
+              <w:t>Nhãn hiển thị cảnh báo lỗi nhập liệu hoặc trạng thái hủy đoàn (chữ đỏ).</w:t>
+            </w:r>
+          </w:p>
+        </w:tc>
+      </w:tr>
+    </w:tbl>
+    <w:p>
+      <w:pPr>
+        <w:spacing w:after="120" w:line="300" w:lineRule="auto"/>
+        <w:ind w:left="504" w:hanging="504"/>
+        <w:jc w:val="both"/>
+        <w:rPr>
+          <w:b/>
+          <w:bCs/>
+        </w:rPr>
+      </w:pPr>
+    </w:p>
+    <w:p>
+      <w:pPr>
+        <w:spacing w:after="120" w:line="300" w:lineRule="auto"/>
+        <w:ind w:left="504" w:hanging="504"/>
+        <w:jc w:val="both"/>
+        <w:rPr>
+          <w:b/>
+          <w:bCs/>
+          <w:lang w:val="vi-VN"/>
+        </w:rPr>
+      </w:pPr>
+      <w:r>
+        <w:rPr>
+          <w:b/>
+          <w:bCs/>
+          <w:lang w:val="vi-VN"/>
+        </w:rPr>
+        <w:t>FrmDieuHanhVaQuyetToan</w:t>
+      </w:r>
+    </w:p>
+    <w:p>
+      <w:pPr>
+        <w:spacing w:after="120" w:line="300" w:lineRule="auto"/>
+        <w:ind w:left="504" w:hanging="504"/>
+        <w:jc w:val="both"/>
+        <w:rPr>
+          <w:b/>
+          <w:bCs/>
+          <w:lang w:val="vi-VN"/>
+        </w:rPr>
+      </w:pPr>
+      <w:r>
+        <w:rPr>
+          <w:lang w:val="vi-VN"/>
+        </w:rPr>
+        <w:drawing>
+          <wp:inline distT="0" distB="0" distL="0" distR="0" wp14:anchorId="157577C5" wp14:editId="17DB9694">
+            <wp:extent cx="5939790" cy="3874135"/>
+            <wp:effectExtent l="0" t="0" r="3810" b="0"/>
+            <wp:docPr id="299298479" name="Picture 1"/>
+            <wp:cNvGraphicFramePr>
+              <a:graphicFrameLocks xmlns:a="http://schemas.openxmlformats.org/drawingml/2006/main" noChangeAspect="1"/>
+            </wp:cNvGraphicFramePr>
+            <a:graphic xmlns:a="http://schemas.openxmlformats.org/drawingml/2006/main">
+              <a:graphicData uri="http://schemas.openxmlformats.org/drawingml/2006/picture">
+                <pic:pic xmlns:pic="http://schemas.openxmlformats.org/drawingml/2006/picture">
+                  <pic:nvPicPr>
+                    <pic:cNvPr id="299298479" name=""/>
+                    <pic:cNvPicPr/>
+                  </pic:nvPicPr>
+                  <pic:blipFill>
+                    <a:blip r:embed="rId16"/>
+                    <a:stretch>
+                      <a:fillRect/>
+                    </a:stretch>
+                  </pic:blipFill>
+                  <pic:spPr>
+                    <a:xfrm>
+                      <a:off x="0" y="0"/>
+                      <a:ext cx="5939790" cy="3874135"/>
+                    </a:xfrm>
+                    <a:prstGeom prst="rect">
+                      <a:avLst/>
+                    </a:prstGeom>
+                  </pic:spPr>
+                </pic:pic>
+              </a:graphicData>
+            </a:graphic>
+          </wp:inline>
+        </w:drawing>
+      </w:r>
+    </w:p>
+    <w:p>
+      <w:pPr>
+        <w:spacing w:after="120" w:line="300" w:lineRule="auto"/>
+        <w:ind w:left="504" w:hanging="504"/>
+        <w:rPr>
+          <w:lang w:val="vi-VN"/>
+        </w:rPr>
+      </w:pPr>
+      <w:r>
+        <w:rPr>
+          <w:lang w:val="vi-VN"/>
+        </w:rPr>
+        <w:t>Kết nối database:</w:t>
+      </w:r>
+    </w:p>
+    <w:p>
+      <w:pPr>
+        <w:spacing w:after="120" w:line="300" w:lineRule="auto"/>
+        <w:ind w:left="504" w:hanging="504"/>
+        <w:rPr>
+          <w:lang w:val="vi-VN"/>
+        </w:rPr>
+      </w:pPr>
+    </w:p>
+    <w:p>
+      <w:pPr>
+        <w:spacing w:after="120" w:line="300" w:lineRule="auto"/>
+        <w:ind w:left="504" w:hanging="504"/>
+        <w:rPr>
+          <w:lang w:val="vi-VN"/>
+        </w:rPr>
+      </w:pPr>
+      <w:r>
+        <w:rPr>
+          <w:lang w:val="vi-VN"/>
+        </w:rPr>
+        <w:lastRenderedPageBreak/>
+        <w:drawing>
+          <wp:inline distT="0" distB="0" distL="0" distR="0" wp14:anchorId="1A6EABA4" wp14:editId="7D37D1F0">
+            <wp:extent cx="5939790" cy="3874135"/>
+            <wp:effectExtent l="0" t="0" r="3810" b="0"/>
+            <wp:docPr id="827817474" name="Picture 1"/>
+            <wp:cNvGraphicFramePr>
+              <a:graphicFrameLocks xmlns:a="http://schemas.openxmlformats.org/drawingml/2006/main" noChangeAspect="1"/>
+            </wp:cNvGraphicFramePr>
+            <a:graphic xmlns:a="http://schemas.openxmlformats.org/drawingml/2006/main">
+              <a:graphicData uri="http://schemas.openxmlformats.org/drawingml/2006/picture">
+                <pic:pic xmlns:pic="http://schemas.openxmlformats.org/drawingml/2006/picture">
+                  <pic:nvPicPr>
+                    <pic:cNvPr id="827817474" name=""/>
+                    <pic:cNvPicPr/>
+                  </pic:nvPicPr>
+                  <pic:blipFill>
+                    <a:blip r:embed="rId16"/>
+                    <a:stretch>
+                      <a:fillRect/>
+                    </a:stretch>
+                  </pic:blipFill>
+                  <pic:spPr>
+                    <a:xfrm>
+                      <a:off x="0" y="0"/>
+                      <a:ext cx="5939790" cy="3874135"/>
+                    </a:xfrm>
+                    <a:prstGeom prst="rect">
+                      <a:avLst/>
+                    </a:prstGeom>
+                  </pic:spPr>
+                </pic:pic>
+              </a:graphicData>
+            </a:graphic>
+          </wp:inline>
+        </w:drawing>
+      </w:r>
+    </w:p>
+    <w:tbl>
+      <w:tblPr>
+        <w:tblStyle w:val="TableGrid"/>
+        <w:tblW w:w="0" w:type="auto"/>
+        <w:tblLook w:val="04A0" w:firstRow="1" w:lastRow="0" w:firstColumn="1" w:lastColumn="0" w:noHBand="0" w:noVBand="1"/>
+      </w:tblPr>
+      <w:tblGrid>
+        <w:gridCol w:w="1839"/>
+        <w:gridCol w:w="7505"/>
+      </w:tblGrid>
+      <w:tr>
+        <w:tc>
+          <w:tcPr>
+            <w:tcW w:w="0" w:type="auto"/>
+            <w:hideMark/>
+          </w:tcPr>
+          <w:p>
+            <w:pPr>
+              <w:spacing w:after="120" w:line="300" w:lineRule="auto"/>
+              <w:ind w:left="504" w:hanging="504"/>
+            </w:pPr>
+            <w:r>
+              <w:rPr>
+                <w:b/>
+                <w:bCs/>
+              </w:rPr>
+              <w:t>Thuộc tính</w:t>
+            </w:r>
+          </w:p>
+        </w:tc>
+        <w:tc>
+          <w:tcPr>
+            <w:tcW w:w="0" w:type="auto"/>
+            <w:hideMark/>
+          </w:tcPr>
+          <w:p>
+            <w:pPr>
+              <w:spacing w:after="120" w:line="300" w:lineRule="auto"/>
+              <w:ind w:left="504" w:hanging="504"/>
+            </w:pPr>
+            <w:r>
+              <w:rPr>
+                <w:b/>
+                <w:bCs/>
+              </w:rPr>
+              <w:t>Thiết kế</w:t>
+            </w:r>
+          </w:p>
+        </w:tc>
+      </w:tr>
+      <w:tr>
+        <w:tc>
+          <w:tcPr>
+            <w:tcW w:w="0" w:type="auto"/>
+            <w:hideMark/>
+          </w:tcPr>
+          <w:p>
+            <w:pPr>
+              <w:spacing w:after="120" w:line="300" w:lineRule="auto"/>
+            </w:pPr>
+            <w:r>
+              <w:t>Mục đích</w:t>
+            </w:r>
+          </w:p>
+        </w:tc>
+        <w:tc>
+          <w:tcPr>
+            <w:tcW w:w="0" w:type="auto"/>
+            <w:hideMark/>
+          </w:tcPr>
+          <w:p>
+            <w:pPr>
+              <w:spacing w:after="120" w:line="300" w:lineRule="auto"/>
+            </w:pPr>
+            <w:r>
+              <w:t>Phân công Hướng dẫn viên (HDV) cho các chuyến đi lẻ/đoàn và quyết toán thu nốt số tiền còn lại khi tour đoàn hoàn tất.</w:t>
+            </w:r>
+          </w:p>
+        </w:tc>
+      </w:tr>
+      <w:tr>
+        <w:tc>
+          <w:tcPr>
+            <w:tcW w:w="0" w:type="auto"/>
+            <w:hideMark/>
+          </w:tcPr>
+          <w:p>
+            <w:pPr>
+              <w:spacing w:after="120" w:line="300" w:lineRule="auto"/>
+            </w:pPr>
+            <w:r>
+              <w:t>Đối tượng sử dụng</w:t>
+            </w:r>
+          </w:p>
+        </w:tc>
+        <w:tc>
+          <w:tcPr>
+            <w:tcW w:w="0" w:type="auto"/>
+            <w:hideMark/>
+          </w:tcPr>
+          <w:p>
+            <w:pPr>
+              <w:spacing w:after="120" w:line="300" w:lineRule="auto"/>
+            </w:pPr>
+            <w:r>
+              <w:t>Nhân viên điều hành và Nhân viên kế toán (Staff).</w:t>
+            </w:r>
+          </w:p>
+        </w:tc>
+      </w:tr>
+      <w:tr>
+        <w:tc>
+          <w:tcPr>
+            <w:tcW w:w="0" w:type="auto"/>
+            <w:hideMark/>
+          </w:tcPr>
+          <w:p>
+            <w:pPr>
+              <w:spacing w:after="120" w:line="300" w:lineRule="auto"/>
+            </w:pPr>
+            <w:r>
+              <w:t>Đọc/Ghi dữ liệu</w:t>
+            </w:r>
+          </w:p>
+        </w:tc>
+        <w:tc>
+          <w:tcPr>
+            <w:tcW w:w="0" w:type="auto"/>
+            <w:hideMark/>
+          </w:tcPr>
+          <w:p>
+            <w:pPr>
+              <w:spacing w:after="120" w:line="300" w:lineRule="auto"/>
+              <w:rPr>
+                <w:lang w:val="vi-VN"/>
+              </w:rPr>
+            </w:pPr>
+            <w:r>
+              <w:t>- Đọc: Bảng Staff, User, ChuyenDiLe, PhieuDangKyDoan, Tour, Customer, PhanCongHDV.</w:t>
+            </w:r>
+          </w:p>
+          <w:p>
+            <w:pPr>
+              <w:spacing w:after="120" w:line="300" w:lineRule="auto"/>
+              <w:rPr>
+                <w:lang w:val="vi-VN"/>
+              </w:rPr>
+            </w:pPr>
+            <w:r>
+              <w:rPr>
+                <w:lang w:val="vi-VN"/>
+              </w:rPr>
+              <w:t>- Ghi: Bảng PhanCongHDV (thêm bản ghi phân công).</w:t>
+            </w:r>
+          </w:p>
+        </w:tc>
+      </w:tr>
+      <w:tr>
+        <w:tc>
+          <w:tcPr>
+            <w:tcW w:w="0" w:type="auto"/>
+            <w:hideMark/>
+          </w:tcPr>
+          <w:p>
+            <w:pPr>
+              <w:spacing w:after="120" w:line="300" w:lineRule="auto"/>
+            </w:pPr>
+            <w:r>
+              <w:t>Input/Output</w:t>
+            </w:r>
+          </w:p>
+        </w:tc>
+        <w:tc>
+          <w:tcPr>
+            <w:tcW w:w="0" w:type="auto"/>
+            <w:hideMark/>
+          </w:tcPr>
+          <w:p>
+            <w:pPr>
+              <w:spacing w:after="120" w:line="300" w:lineRule="auto"/>
+              <w:rPr>
+                <w:lang w:val="vi-VN"/>
+              </w:rPr>
+            </w:pPr>
+            <w:r>
+              <w:t>- Input: Chọn loại phân công (Chuyến lẻ/Tour đoàn), Chọn HDV, Ngày phân công; Chọn phiếu đoàn cần quyết toán.</w:t>
+            </w:r>
+          </w:p>
+          <w:p>
+            <w:pPr>
+              <w:spacing w:after="120" w:line="300" w:lineRule="auto"/>
+              <w:rPr>
+                <w:lang w:val="vi-VN"/>
+              </w:rPr>
+            </w:pPr>
+            <w:r>
+              <w:rPr>
+                <w:lang w:val="vi-VN"/>
+              </w:rPr>
+              <w:t>- Output: Cảnh báo đỏ nếu trùng lịch HDV, thông báo phân công thành công; Hiển thị tổng tiền, cọc, tiền còn lại và xác nhận quyết toán.</w:t>
+            </w:r>
+          </w:p>
+        </w:tc>
+      </w:tr>
+      <w:tr>
+        <w:tc>
+          <w:tcPr>
+            <w:tcW w:w="0" w:type="auto"/>
+            <w:hideMark/>
+          </w:tcPr>
+          <w:p>
+            <w:pPr>
+              <w:spacing w:after="120" w:line="300" w:lineRule="auto"/>
+            </w:pPr>
+            <w:r>
+              <w:t>Kịch bản/Validation</w:t>
+            </w:r>
+          </w:p>
+        </w:tc>
+        <w:tc>
+          <w:tcPr>
+            <w:tcW w:w="0" w:type="auto"/>
+            <w:hideMark/>
+          </w:tcPr>
+          <w:p>
+            <w:pPr>
+              <w:spacing w:after="120" w:line="300" w:lineRule="auto"/>
+            </w:pPr>
+            <w:r>
+              <w:t>Kiểm tra trùng lịch HDV theo ngày (Flow 4a); Tự động lấy ngày khởi hành theo chuyến/đoàn; Tự động tính tiền còn lại (Tổng tiền - Tiền cọc); Khóa chỉnh sửa ô số tiền.</w:t>
+            </w:r>
+          </w:p>
+        </w:tc>
+      </w:tr>
+    </w:tbl>
+    <w:p>
+      <w:pPr>
+        <w:spacing w:after="120" w:line="300" w:lineRule="auto"/>
+        <w:ind w:left="504" w:hanging="504"/>
+      </w:pPr>
+    </w:p>
+    <w:tbl>
+      <w:tblPr>
+        <w:tblStyle w:val="TableGrid"/>
+        <w:tblW w:w="0" w:type="auto"/>
+        <w:tblLook w:val="04A0" w:firstRow="1" w:lastRow="0" w:firstColumn="1" w:lastColumn="0" w:noHBand="0" w:noVBand="1"/>
+      </w:tblPr>
+      <w:tblGrid>
+        <w:gridCol w:w="2709"/>
+        <w:gridCol w:w="1789"/>
+        <w:gridCol w:w="4846"/>
+      </w:tblGrid>
+      <w:tr>
+        <w:tc>
+          <w:tcPr>
+            <w:tcW w:w="0" w:type="auto"/>
+            <w:hideMark/>
+          </w:tcPr>
+          <w:p>
+            <w:pPr>
+              <w:spacing w:after="120" w:line="300" w:lineRule="auto"/>
+              <w:ind w:left="504" w:hanging="504"/>
+            </w:pPr>
+            <w:r>
+              <w:rPr>
+                <w:b/>
+                <w:bCs/>
+              </w:rPr>
+              <w:t>(Name)</w:t>
+            </w:r>
+          </w:p>
+        </w:tc>
+        <w:tc>
+          <w:tcPr>
+            <w:tcW w:w="0" w:type="auto"/>
+            <w:hideMark/>
+          </w:tcPr>
+          <w:p>
+            <w:pPr>
+              <w:spacing w:after="120" w:line="300" w:lineRule="auto"/>
+              <w:ind w:left="504" w:hanging="504"/>
+            </w:pPr>
+            <w:r>
+              <w:rPr>
+                <w:b/>
+                <w:bCs/>
+              </w:rPr>
+              <w:t>Control</w:t>
+            </w:r>
+          </w:p>
+        </w:tc>
+        <w:tc>
+          <w:tcPr>
+            <w:tcW w:w="0" w:type="auto"/>
+            <w:hideMark/>
+          </w:tcPr>
+          <w:p>
+            <w:pPr>
+              <w:spacing w:after="120" w:line="300" w:lineRule="auto"/>
+              <w:ind w:left="504" w:hanging="504"/>
+            </w:pPr>
+            <w:r>
+              <w:rPr>
+                <w:b/>
+                <w:bCs/>
+              </w:rPr>
+              <w:t>Ý nghĩa</w:t>
+            </w:r>
+          </w:p>
+        </w:tc>
+      </w:tr>
+      <w:tr>
+        <w:tc>
+          <w:tcPr>
+            <w:tcW w:w="0" w:type="auto"/>
+            <w:hideMark/>
+          </w:tcPr>
+          <w:p>
+            <w:pPr>
+              <w:spacing w:after="120" w:line="300" w:lineRule="auto"/>
+              <w:ind w:left="504" w:hanging="504"/>
+            </w:pPr>
+            <w:r>
+              <w:t>tabControlMain</w:t>
+            </w:r>
+          </w:p>
+        </w:tc>
+        <w:tc>
+          <w:tcPr>
+            <w:tcW w:w="0" w:type="auto"/>
+            <w:hideMark/>
+          </w:tcPr>
+          <w:p>
+            <w:pPr>
+              <w:spacing w:after="120" w:line="300" w:lineRule="auto"/>
+              <w:ind w:left="504" w:hanging="504"/>
+            </w:pPr>
+            <w:r>
+              <w:t>TabControl</w:t>
+            </w:r>
+          </w:p>
+        </w:tc>
+        <w:tc>
+          <w:tcPr>
+            <w:tcW w:w="0" w:type="auto"/>
+            <w:hideMark/>
+          </w:tcPr>
+          <w:p>
+            <w:pPr>
+              <w:spacing w:after="120" w:line="300" w:lineRule="auto"/>
+            </w:pPr>
+            <w:r>
+              <w:t>Quản lý chuyển đổi giữa Tab Phân công HDV và Tab Quyết toán.</w:t>
+            </w:r>
+          </w:p>
+        </w:tc>
+      </w:tr>
+      <w:tr>
+        <w:tc>
+          <w:tcPr>
+            <w:tcW w:w="0" w:type="auto"/>
+            <w:hideMark/>
+          </w:tcPr>
+          <w:p>
+            <w:pPr>
+              <w:spacing w:after="120" w:line="300" w:lineRule="auto"/>
+              <w:ind w:left="504" w:hanging="504"/>
+            </w:pPr>
+            <w:r>
+              <w:lastRenderedPageBreak/>
+              <w:t>tabPhanCong</w:t>
+            </w:r>
+          </w:p>
+        </w:tc>
+        <w:tc>
+          <w:tcPr>
+            <w:tcW w:w="0" w:type="auto"/>
+            <w:hideMark/>
+          </w:tcPr>
+          <w:p>
+            <w:pPr>
+              <w:spacing w:after="120" w:line="300" w:lineRule="auto"/>
+              <w:ind w:left="504" w:hanging="504"/>
+            </w:pPr>
+            <w:r>
+              <w:t>TabPage</w:t>
+            </w:r>
+          </w:p>
+        </w:tc>
+        <w:tc>
+          <w:tcPr>
+            <w:tcW w:w="0" w:type="auto"/>
+            <w:hideMark/>
+          </w:tcPr>
+          <w:p>
+            <w:pPr>
+              <w:spacing w:after="120" w:line="300" w:lineRule="auto"/>
+            </w:pPr>
+            <w:r>
+              <w:t>Chứa giao diện thao tác phân công Hướng dẫn viên.</w:t>
+            </w:r>
+          </w:p>
+        </w:tc>
+      </w:tr>
+      <w:tr>
+        <w:tc>
+          <w:tcPr>
+            <w:tcW w:w="0" w:type="auto"/>
+            <w:hideMark/>
+          </w:tcPr>
+          <w:p>
+            <w:pPr>
+              <w:spacing w:after="120" w:line="300" w:lineRule="auto"/>
+              <w:ind w:left="504" w:hanging="504"/>
+            </w:pPr>
+            <w:r>
+              <w:t>rdoChuyenLe</w:t>
+            </w:r>
+          </w:p>
+        </w:tc>
+        <w:tc>
+          <w:tcPr>
+            <w:tcW w:w="0" w:type="auto"/>
+            <w:hideMark/>
+          </w:tcPr>
+          <w:p>
+            <w:pPr>
+              <w:spacing w:after="120" w:line="300" w:lineRule="auto"/>
+              <w:ind w:left="504" w:hanging="504"/>
+            </w:pPr>
+            <w:r>
+              <w:t>RadioButton</w:t>
+            </w:r>
+          </w:p>
+        </w:tc>
+        <w:tc>
+          <w:tcPr>
+            <w:tcW w:w="0" w:type="auto"/>
+            <w:hideMark/>
+          </w:tcPr>
+          <w:p>
+            <w:pPr>
+              <w:spacing w:after="120" w:line="300" w:lineRule="auto"/>
+            </w:pPr>
+            <w:r>
+              <w:t>Tùy chọn phân công HDV cho Chuyến đi lẻ.</w:t>
+            </w:r>
+          </w:p>
+        </w:tc>
+      </w:tr>
+      <w:tr>
+        <w:tc>
+          <w:tcPr>
+            <w:tcW w:w="0" w:type="auto"/>
+            <w:hideMark/>
+          </w:tcPr>
+          <w:p>
+            <w:pPr>
+              <w:spacing w:after="120" w:line="300" w:lineRule="auto"/>
+              <w:ind w:left="504" w:hanging="504"/>
+            </w:pPr>
+            <w:r>
+              <w:t>rdoTourDoan</w:t>
+            </w:r>
+          </w:p>
+        </w:tc>
+        <w:tc>
+          <w:tcPr>
+            <w:tcW w:w="0" w:type="auto"/>
+            <w:hideMark/>
+          </w:tcPr>
+          <w:p>
+            <w:pPr>
+              <w:spacing w:after="120" w:line="300" w:lineRule="auto"/>
+              <w:ind w:left="504" w:hanging="504"/>
+            </w:pPr>
+            <w:r>
+              <w:t>RadioButton</w:t>
+            </w:r>
+          </w:p>
+        </w:tc>
+        <w:tc>
+          <w:tcPr>
+            <w:tcW w:w="0" w:type="auto"/>
+            <w:hideMark/>
+          </w:tcPr>
+          <w:p>
+            <w:pPr>
+              <w:spacing w:after="120" w:line="300" w:lineRule="auto"/>
+            </w:pPr>
+            <w:r>
+              <w:t>Tùy chọn phân công HDV cho Tour đoàn.</w:t>
+            </w:r>
+          </w:p>
+        </w:tc>
+      </w:tr>
+      <w:tr>
+        <w:tc>
+          <w:tcPr>
+            <w:tcW w:w="0" w:type="auto"/>
+            <w:hideMark/>
+          </w:tcPr>
+          <w:p>
+            <w:pPr>
+              <w:spacing w:after="120" w:line="300" w:lineRule="auto"/>
+              <w:ind w:left="504" w:hanging="504"/>
+            </w:pPr>
+            <w:r>
+              <w:t>cboDoiTuongPC</w:t>
+            </w:r>
+          </w:p>
+        </w:tc>
+        <w:tc>
+          <w:tcPr>
+            <w:tcW w:w="0" w:type="auto"/>
+            <w:hideMark/>
+          </w:tcPr>
+          <w:p>
+            <w:pPr>
+              <w:spacing w:after="120" w:line="300" w:lineRule="auto"/>
+              <w:ind w:left="504" w:hanging="504"/>
+            </w:pPr>
+            <w:r>
+              <w:t>ComboBox</w:t>
+            </w:r>
+          </w:p>
+        </w:tc>
+        <w:tc>
+          <w:tcPr>
+            <w:tcW w:w="0" w:type="auto"/>
+            <w:hideMark/>
+          </w:tcPr>
+          <w:p>
+            <w:pPr>
+              <w:spacing w:after="120" w:line="300" w:lineRule="auto"/>
+            </w:pPr>
+            <w:r>
+              <w:t>Danh sách chọn chuyến đi lẻ hoặc phiếu tour đoàn.</w:t>
+            </w:r>
+          </w:p>
+        </w:tc>
+      </w:tr>
+      <w:tr>
+        <w:tc>
+          <w:tcPr>
+            <w:tcW w:w="0" w:type="auto"/>
+            <w:hideMark/>
+          </w:tcPr>
+          <w:p>
+            <w:pPr>
+              <w:spacing w:after="120" w:line="300" w:lineRule="auto"/>
+              <w:ind w:left="504" w:hanging="504"/>
+            </w:pPr>
+            <w:r>
+              <w:t>cboHDV</w:t>
+            </w:r>
+          </w:p>
+        </w:tc>
+        <w:tc>
+          <w:tcPr>
+            <w:tcW w:w="0" w:type="auto"/>
+            <w:hideMark/>
+          </w:tcPr>
+          <w:p>
+            <w:pPr>
+              <w:spacing w:after="120" w:line="300" w:lineRule="auto"/>
+              <w:ind w:left="504" w:hanging="504"/>
+            </w:pPr>
+            <w:r>
+              <w:t>ComboBox</w:t>
+            </w:r>
+          </w:p>
+        </w:tc>
+        <w:tc>
+          <w:tcPr>
+            <w:tcW w:w="0" w:type="auto"/>
+            <w:hideMark/>
+          </w:tcPr>
+          <w:p>
+            <w:pPr>
+              <w:spacing w:after="120" w:line="300" w:lineRule="auto"/>
+            </w:pPr>
+            <w:r>
+              <w:t>Danh sách chọn Hướng dẫn viên.</w:t>
+            </w:r>
+          </w:p>
+        </w:tc>
+      </w:tr>
+      <w:tr>
+        <w:tc>
+          <w:tcPr>
+            <w:tcW w:w="0" w:type="auto"/>
+            <w:hideMark/>
+          </w:tcPr>
+          <w:p>
+            <w:pPr>
+              <w:spacing w:after="120" w:line="300" w:lineRule="auto"/>
+              <w:ind w:left="504" w:hanging="504"/>
+            </w:pPr>
+            <w:r>
+              <w:t>dtpNgayPhanCong</w:t>
+            </w:r>
+          </w:p>
+        </w:tc>
+        <w:tc>
+          <w:tcPr>
+            <w:tcW w:w="0" w:type="auto"/>
+            <w:hideMark/>
+          </w:tcPr>
+          <w:p>
+            <w:pPr>
+              <w:spacing w:after="120" w:line="300" w:lineRule="auto"/>
+              <w:ind w:left="504" w:hanging="504"/>
+            </w:pPr>
+            <w:r>
+              <w:t>DateTimePicker</w:t>
+            </w:r>
+          </w:p>
+        </w:tc>
+        <w:tc>
+          <w:tcPr>
+            <w:tcW w:w="0" w:type="auto"/>
+            <w:hideMark/>
+          </w:tcPr>
+          <w:p>
+            <w:pPr>
+              <w:spacing w:after="120" w:line="300" w:lineRule="auto"/>
+            </w:pPr>
+            <w:r>
+              <w:t>Hiển thị ngày phân công theo ngày tour khởi hành (ReadOnly).</w:t>
+            </w:r>
+          </w:p>
+        </w:tc>
+      </w:tr>
+      <w:tr>
+        <w:tc>
+          <w:tcPr>
+            <w:tcW w:w="0" w:type="auto"/>
+            <w:hideMark/>
+          </w:tcPr>
+          <w:p>
+            <w:pPr>
+              <w:spacing w:after="120" w:line="300" w:lineRule="auto"/>
+              <w:ind w:left="504" w:hanging="504"/>
+            </w:pPr>
+            <w:r>
+              <w:t>btnPhanCong</w:t>
+            </w:r>
+          </w:p>
+        </w:tc>
+        <w:tc>
+          <w:tcPr>
+            <w:tcW w:w="0" w:type="auto"/>
+            <w:hideMark/>
+          </w:tcPr>
+          <w:p>
+            <w:pPr>
+              <w:spacing w:after="120" w:line="300" w:lineRule="auto"/>
+              <w:ind w:left="504" w:hanging="504"/>
+            </w:pPr>
+            <w:r>
+              <w:t>Button</w:t>
+            </w:r>
+          </w:p>
+        </w:tc>
+        <w:tc>
+          <w:tcPr>
+            <w:tcW w:w="0" w:type="auto"/>
+            <w:hideMark/>
+          </w:tcPr>
+          <w:p>
+            <w:pPr>
+              <w:spacing w:after="120" w:line="300" w:lineRule="auto"/>
+            </w:pPr>
+            <w:r>
+              <w:t>Nút kiểm tra trùng lịch và xác nhận phân công HDV.</w:t>
+            </w:r>
+          </w:p>
+        </w:tc>
+      </w:tr>
+      <w:tr>
+        <w:tc>
+          <w:tcPr>
+            <w:tcW w:w="0" w:type="auto"/>
+            <w:hideMark/>
+          </w:tcPr>
+          <w:p>
+            <w:pPr>
+              <w:spacing w:after="120" w:line="300" w:lineRule="auto"/>
+              <w:ind w:left="504" w:hanging="504"/>
+            </w:pPr>
+            <w:r>
+              <w:t>lblErrorPhanCong</w:t>
+            </w:r>
+          </w:p>
+        </w:tc>
+        <w:tc>
+          <w:tcPr>
+            <w:tcW w:w="0" w:type="auto"/>
+            <w:hideMark/>
+          </w:tcPr>
+          <w:p>
+            <w:pPr>
+              <w:spacing w:after="120" w:line="300" w:lineRule="auto"/>
+              <w:ind w:left="504" w:hanging="504"/>
+            </w:pPr>
+            <w:r>
+              <w:t>Label</w:t>
+            </w:r>
+          </w:p>
+        </w:tc>
+        <w:tc>
+          <w:tcPr>
+            <w:tcW w:w="0" w:type="auto"/>
+            <w:hideMark/>
+          </w:tcPr>
+          <w:p>
+            <w:pPr>
+              <w:spacing w:after="120" w:line="300" w:lineRule="auto"/>
+            </w:pPr>
+            <w:r>
+              <w:t>Nhãn hiển thị cảnh báo đỏ khi HDV bị trùng lịch tour khác.</w:t>
+            </w:r>
+          </w:p>
+        </w:tc>
+      </w:tr>
+      <w:tr>
+        <w:tc>
+          <w:tcPr>
+            <w:tcW w:w="0" w:type="auto"/>
+            <w:hideMark/>
+          </w:tcPr>
+          <w:p>
+            <w:pPr>
+              <w:spacing w:after="120" w:line="300" w:lineRule="auto"/>
+              <w:ind w:left="504" w:hanging="504"/>
+            </w:pPr>
+            <w:r>
+              <w:t>tabQuyetToan</w:t>
+            </w:r>
+          </w:p>
+        </w:tc>
+        <w:tc>
+          <w:tcPr>
+            <w:tcW w:w="0" w:type="auto"/>
+            <w:hideMark/>
+          </w:tcPr>
+          <w:p>
+            <w:pPr>
+              <w:spacing w:after="120" w:line="300" w:lineRule="auto"/>
+              <w:ind w:left="504" w:hanging="504"/>
+            </w:pPr>
+            <w:r>
+              <w:t>TabPage</w:t>
+            </w:r>
+          </w:p>
+        </w:tc>
+        <w:tc>
+          <w:tcPr>
+            <w:tcW w:w="0" w:type="auto"/>
+            <w:hideMark/>
+          </w:tcPr>
+          <w:p>
+            <w:pPr>
+              <w:spacing w:after="120" w:line="300" w:lineRule="auto"/>
+            </w:pPr>
+            <w:r>
+              <w:t>Chứa giao diện quyết toán kinh phí tour đoàn.</w:t>
+            </w:r>
+          </w:p>
+        </w:tc>
+      </w:tr>
+      <w:tr>
+        <w:tc>
+          <w:tcPr>
+            <w:tcW w:w="0" w:type="auto"/>
+            <w:hideMark/>
+          </w:tcPr>
+          <w:p>
+            <w:pPr>
+              <w:spacing w:after="120" w:line="300" w:lineRule="auto"/>
+              <w:ind w:left="504" w:hanging="504"/>
+            </w:pPr>
+            <w:r>
+              <w:t>cboPhieuDoanQuyetToan</w:t>
+            </w:r>
+          </w:p>
+        </w:tc>
+        <w:tc>
+          <w:tcPr>
+            <w:tcW w:w="0" w:type="auto"/>
+            <w:hideMark/>
+          </w:tcPr>
+          <w:p>
+            <w:pPr>
+              <w:spacing w:after="120" w:line="300" w:lineRule="auto"/>
+              <w:ind w:left="504" w:hanging="504"/>
+            </w:pPr>
+            <w:r>
+              <w:t>ComboBox</w:t>
+            </w:r>
+          </w:p>
+        </w:tc>
+        <w:tc>
+          <w:tcPr>
+            <w:tcW w:w="0" w:type="auto"/>
+            <w:hideMark/>
+          </w:tcPr>
+          <w:p>
+            <w:pPr>
+              <w:spacing w:after="120" w:line="300" w:lineRule="auto"/>
+            </w:pPr>
+            <w:r>
+              <w:t>Danh sách chọn phiếu tour đoàn cần quyết toán.</w:t>
+            </w:r>
+          </w:p>
+        </w:tc>
+      </w:tr>
+      <w:tr>
+        <w:tc>
+          <w:tcPr>
+            <w:tcW w:w="0" w:type="auto"/>
+            <w:hideMark/>
+          </w:tcPr>
+          <w:p>
+            <w:pPr>
+              <w:spacing w:after="120" w:line="300" w:lineRule="auto"/>
+              <w:ind w:left="504" w:hanging="504"/>
+            </w:pPr>
+            <w:r>
+              <w:t>txtTongTienTour</w:t>
+            </w:r>
+          </w:p>
+        </w:tc>
+        <w:tc>
+          <w:tcPr>
+            <w:tcW w:w="0" w:type="auto"/>
+            <w:hideMark/>
+          </w:tcPr>
+          <w:p>
+            <w:pPr>
+              <w:spacing w:after="120" w:line="300" w:lineRule="auto"/>
+              <w:ind w:left="504" w:hanging="504"/>
+            </w:pPr>
+            <w:r>
+              <w:t>TextBox</w:t>
+            </w:r>
+          </w:p>
+        </w:tc>
+        <w:tc>
+          <w:tcPr>
+            <w:tcW w:w="0" w:type="auto"/>
+            <w:hideMark/>
+          </w:tcPr>
+          <w:p>
+            <w:pPr>
+              <w:spacing w:after="120" w:line="300" w:lineRule="auto"/>
+            </w:pPr>
+            <w:r>
+              <w:t>Ô hiển thị tổng giá trị hợp đồng tour đoàn (ReadOnly).</w:t>
+            </w:r>
+          </w:p>
+        </w:tc>
+      </w:tr>
+      <w:tr>
+        <w:tc>
+          <w:tcPr>
+            <w:tcW w:w="0" w:type="auto"/>
+            <w:hideMark/>
+          </w:tcPr>
+          <w:p>
+            <w:pPr>
+              <w:spacing w:after="120" w:line="300" w:lineRule="auto"/>
+              <w:ind w:left="504" w:hanging="504"/>
+            </w:pPr>
+            <w:r>
+              <w:t>txtTienCocDaNop</w:t>
+            </w:r>
+          </w:p>
+        </w:tc>
+        <w:tc>
+          <w:tcPr>
+            <w:tcW w:w="0" w:type="auto"/>
+            <w:hideMark/>
+          </w:tcPr>
+          <w:p>
+            <w:pPr>
+              <w:spacing w:after="120" w:line="300" w:lineRule="auto"/>
+              <w:ind w:left="504" w:hanging="504"/>
+            </w:pPr>
+            <w:r>
+              <w:t>TextBox</w:t>
+            </w:r>
+          </w:p>
+        </w:tc>
+        <w:tc>
+          <w:tcPr>
+            <w:tcW w:w="0" w:type="auto"/>
+            <w:hideMark/>
+          </w:tcPr>
+          <w:p>
+            <w:pPr>
+              <w:spacing w:after="120" w:line="300" w:lineRule="auto"/>
+            </w:pPr>
+            <w:r>
+              <w:t>Ô hiển thị số tiền cọc đã nộp trước đó (ReadOnly).</w:t>
+            </w:r>
+          </w:p>
+        </w:tc>
+      </w:tr>
+      <w:tr>
+        <w:tc>
+          <w:tcPr>
+            <w:tcW w:w="0" w:type="auto"/>
+            <w:hideMark/>
+          </w:tcPr>
+          <w:p>
+            <w:pPr>
+              <w:spacing w:after="120" w:line="300" w:lineRule="auto"/>
+              <w:ind w:left="504" w:hanging="504"/>
+            </w:pPr>
+            <w:r>
+              <w:t>txtTienConLai</w:t>
+            </w:r>
+          </w:p>
+        </w:tc>
+        <w:tc>
+          <w:tcPr>
+            <w:tcW w:w="0" w:type="auto"/>
+            <w:hideMark/>
+          </w:tcPr>
+          <w:p>
+            <w:pPr>
+              <w:spacing w:after="120" w:line="300" w:lineRule="auto"/>
+              <w:ind w:left="504" w:hanging="504"/>
+            </w:pPr>
+            <w:r>
+              <w:t>TextBox</w:t>
+            </w:r>
+          </w:p>
+        </w:tc>
+        <w:tc>
+          <w:tcPr>
+            <w:tcW w:w="0" w:type="auto"/>
+            <w:hideMark/>
+          </w:tcPr>
+          <w:p>
+            <w:pPr>
+              <w:spacing w:after="120" w:line="300" w:lineRule="auto"/>
+            </w:pPr>
+            <w:r>
+              <w:t>Ô hiển thị số tiền còn lại phải thu nốt (ReadOnly, chữ đỏ).</w:t>
+            </w:r>
+          </w:p>
+        </w:tc>
+      </w:tr>
+      <w:tr>
+        <w:tc>
+          <w:tcPr>
+            <w:tcW w:w="0" w:type="auto"/>
+            <w:hideMark/>
+          </w:tcPr>
+          <w:p>
+            <w:pPr>
+              <w:spacing w:after="120" w:line="300" w:lineRule="auto"/>
+              <w:ind w:left="504" w:hanging="504"/>
+            </w:pPr>
+            <w:r>
+              <w:t>btnQuyetToan</w:t>
+            </w:r>
+          </w:p>
+        </w:tc>
+        <w:tc>
+          <w:tcPr>
+            <w:tcW w:w="0" w:type="auto"/>
+            <w:hideMark/>
+          </w:tcPr>
+          <w:p>
+            <w:pPr>
+              <w:spacing w:after="120" w:line="300" w:lineRule="auto"/>
+              <w:ind w:left="504" w:hanging="504"/>
+            </w:pPr>
+            <w:r>
+              <w:t>Button</w:t>
+            </w:r>
+          </w:p>
+        </w:tc>
+        <w:tc>
+          <w:tcPr>
+            <w:tcW w:w="0" w:type="auto"/>
+            <w:hideMark/>
+          </w:tcPr>
+          <w:p>
+            <w:pPr>
+              <w:spacing w:after="120" w:line="300" w:lineRule="auto"/>
+            </w:pPr>
+            <w:r>
+              <w:t>Nút thu nốt số tiền còn lại và hoàn tất quyết toán.</w:t>
+            </w:r>
+          </w:p>
+        </w:tc>
+      </w:tr>
+      <w:tr>
+        <w:tc>
+          <w:tcPr>
+            <w:tcW w:w="0" w:type="auto"/>
+            <w:hideMark/>
+          </w:tcPr>
+          <w:p>
+            <w:pPr>
+              <w:spacing w:after="120" w:line="300" w:lineRule="auto"/>
+              <w:ind w:left="504" w:hanging="504"/>
+            </w:pPr>
+            <w:r>
+              <w:t>lblStatusQuyetToan</w:t>
+            </w:r>
+          </w:p>
+        </w:tc>
+        <w:tc>
+          <w:tcPr>
+            <w:tcW w:w="0" w:type="auto"/>
+            <w:hideMark/>
+          </w:tcPr>
+          <w:p>
+            <w:pPr>
+              <w:spacing w:after="120" w:line="300" w:lineRule="auto"/>
+              <w:ind w:left="504" w:hanging="504"/>
+            </w:pPr>
+            <w:r>
+              <w:t>Label</w:t>
+            </w:r>
+          </w:p>
+        </w:tc>
+        <w:tc>
+          <w:tcPr>
+            <w:tcW w:w="0" w:type="auto"/>
+            <w:hideMark/>
+          </w:tcPr>
+          <w:p>
+            <w:pPr>
+              <w:spacing w:after="120" w:line="300" w:lineRule="auto"/>
+            </w:pPr>
+            <w:r>
+              <w:t>Nhãn hiển thị trạng thái kết quả quyết toán.</w:t>
+            </w:r>
+          </w:p>
+        </w:tc>
+      </w:tr>
+    </w:tbl>
+    <w:p>
+      <w:pPr>
+        <w:spacing w:after="120" w:line="300" w:lineRule="auto"/>
+        <w:ind w:left="504" w:hanging="504"/>
+      </w:pPr>
+    </w:p>
+    <w:p>
+      <w:pPr>
+        <w:spacing w:after="120" w:line="300" w:lineRule="auto"/>
+        <w:ind w:left="504" w:hanging="504"/>
+        <w:jc w:val="both"/>
+        <w:rPr>
+          <w:b/>
+          <w:bCs/>
+          <w:lang w:val="vi-VN"/>
+        </w:rPr>
+      </w:pPr>
+      <w:r>
+        <w:rPr>
+          <w:b/>
+          <w:bCs/>
+          <w:lang w:val="vi-VN"/>
+        </w:rPr>
+        <w:t>FrmKhaoSatTour</w:t>
+      </w:r>
+    </w:p>
+    <w:p>
+      <w:pPr>
+        <w:spacing w:after="120" w:line="300" w:lineRule="auto"/>
+        <w:ind w:left="504" w:hanging="504"/>
+        <w:jc w:val="both"/>
+        <w:rPr>
+          <w:b/>
+          <w:bCs/>
+          <w:lang w:val="vi-VN"/>
+        </w:rPr>
+      </w:pPr>
+      <w:r>
+        <w:rPr>
+          <w:lang w:val="vi-VN"/>
+        </w:rPr>
+        <w:lastRenderedPageBreak/>
+        <w:drawing>
+          <wp:inline distT="0" distB="0" distL="0" distR="0" wp14:anchorId="32D5F4F4" wp14:editId="6B953B2B">
+            <wp:extent cx="5939790" cy="3824605"/>
+            <wp:effectExtent l="0" t="0" r="3810" b="4445"/>
+            <wp:docPr id="1873102306" name="Picture 1"/>
+            <wp:cNvGraphicFramePr>
+              <a:graphicFrameLocks xmlns:a="http://schemas.openxmlformats.org/drawingml/2006/main" noChangeAspect="1"/>
+            </wp:cNvGraphicFramePr>
+            <a:graphic xmlns:a="http://schemas.openxmlformats.org/drawingml/2006/main">
+              <a:graphicData uri="http://schemas.openxmlformats.org/drawingml/2006/picture">
+                <pic:pic xmlns:pic="http://schemas.openxmlformats.org/drawingml/2006/picture">
+                  <pic:nvPicPr>
+                    <pic:cNvPr id="1873102306" name=""/>
+                    <pic:cNvPicPr/>
+                  </pic:nvPicPr>
+                  <pic:blipFill>
+                    <a:blip r:embed="rId17"/>
+                    <a:stretch>
+                      <a:fillRect/>
+                    </a:stretch>
+                  </pic:blipFill>
+                  <pic:spPr>
+                    <a:xfrm>
+                      <a:off x="0" y="0"/>
+                      <a:ext cx="5939790" cy="3824605"/>
+                    </a:xfrm>
+                    <a:prstGeom prst="rect">
+                      <a:avLst/>
+                    </a:prstGeom>
+                  </pic:spPr>
+                </pic:pic>
+              </a:graphicData>
+            </a:graphic>
+          </wp:inline>
+        </w:drawing>
+      </w:r>
+    </w:p>
+    <w:p>
+      <w:pPr>
+        <w:spacing w:after="120" w:line="300" w:lineRule="auto"/>
+        <w:ind w:left="504" w:hanging="504"/>
+        <w:rPr>
+          <w:lang w:val="vi-VN"/>
+        </w:rPr>
+      </w:pPr>
+      <w:r>
+        <w:rPr>
+          <w:lang w:val="vi-VN"/>
+        </w:rPr>
+        <w:t xml:space="preserve">Kết nối với </w:t>
+      </w:r>
+      <w:r>
+        <w:rPr>
+          <w:lang w:val="vi-VN"/>
+        </w:rPr>
+        <w:t>database:</w:t>
+      </w:r>
+    </w:p>
+    <w:p>
+      <w:pPr>
+        <w:spacing w:after="120" w:line="300" w:lineRule="auto"/>
+        <w:ind w:left="504" w:hanging="504"/>
+        <w:rPr>
+          <w:lang w:val="vi-VN"/>
+        </w:rPr>
+      </w:pPr>
+      <w:r>
+        <w:rPr>
+          <w:lang w:val="vi-VN"/>
+        </w:rPr>
+        <w:drawing>
+          <wp:inline distT="0" distB="0" distL="0" distR="0" wp14:anchorId="6C51F7D8" wp14:editId="40189BB4">
+            <wp:extent cx="5939790" cy="3443605"/>
+            <wp:effectExtent l="0" t="0" r="3810" b="4445"/>
+            <wp:docPr id="1547591358" name="Picture 1"/>
+            <wp:cNvGraphicFramePr>
+              <a:graphicFrameLocks xmlns:a="http://schemas.openxmlformats.org/drawingml/2006/main" noChangeAspect="1"/>
+            </wp:cNvGraphicFramePr>
+            <a:graphic xmlns:a="http://schemas.openxmlformats.org/drawingml/2006/main">
+              <a:graphicData uri="http://schemas.openxmlformats.org/drawingml/2006/picture">
+                <pic:pic xmlns:pic="http://schemas.openxmlformats.org/drawingml/2006/picture">
+                  <pic:nvPicPr>
+                    <pic:cNvPr id="1547591358" name=""/>
+                    <pic:cNvPicPr/>
+                  </pic:nvPicPr>
+                  <pic:blipFill>
+                    <a:blip r:embed="rId18"/>
+                    <a:stretch>
+                      <a:fillRect/>
+                    </a:stretch>
+                  </pic:blipFill>
+                  <pic:spPr>
+                    <a:xfrm>
+                      <a:off x="0" y="0"/>
+                      <a:ext cx="5939790" cy="3443605"/>
+                    </a:xfrm>
+                    <a:prstGeom prst="rect">
+                      <a:avLst/>
+                    </a:prstGeom>
+                  </pic:spPr>
+                </pic:pic>
+              </a:graphicData>
+            </a:graphic>
+          </wp:inline>
+        </w:drawing>
+      </w:r>
+    </w:p>
+    <w:tbl>
+      <w:tblPr>
+        <w:tblStyle w:val="TableGrid"/>
+        <w:tblW w:w="0" w:type="auto"/>
+        <w:tblLook w:val="04A0" w:firstRow="1" w:lastRow="0" w:firstColumn="1" w:lastColumn="0" w:noHBand="0" w:noVBand="1"/>
+      </w:tblPr>
+      <w:tblGrid>
+        <w:gridCol w:w="1813"/>
+        <w:gridCol w:w="7531"/>
+      </w:tblGrid>
+      <w:tr>
+        <w:tc>
+          <w:tcPr>
+            <w:tcW w:w="0" w:type="auto"/>
+            <w:hideMark/>
+          </w:tcPr>
+          <w:p>
+            <w:pPr>
+              <w:spacing w:after="120" w:line="300" w:lineRule="auto"/>
+              <w:ind w:left="504" w:hanging="504"/>
+            </w:pPr>
+            <w:r>
+              <w:rPr>
+                <w:b/>
+                <w:bCs/>
+              </w:rPr>
+              <w:t>Thuộc tính</w:t>
+            </w:r>
+          </w:p>
+        </w:tc>
+        <w:tc>
+          <w:tcPr>
+            <w:tcW w:w="0" w:type="auto"/>
+            <w:hideMark/>
+          </w:tcPr>
+          <w:p>
+            <w:pPr>
+              <w:spacing w:after="120" w:line="300" w:lineRule="auto"/>
+              <w:ind w:left="504" w:hanging="504"/>
+            </w:pPr>
+            <w:r>
+              <w:rPr>
+                <w:b/>
+                <w:bCs/>
+              </w:rPr>
+              <w:t>Thiết kế</w:t>
+            </w:r>
+          </w:p>
+        </w:tc>
+      </w:tr>
+      <w:tr>
+        <w:tc>
+          <w:tcPr>
+            <w:tcW w:w="0" w:type="auto"/>
+            <w:hideMark/>
+          </w:tcPr>
+          <w:p>
+            <w:pPr>
+              <w:spacing w:after="120" w:line="300" w:lineRule="auto"/>
+            </w:pPr>
+            <w:r>
+              <w:t>Mục đích</w:t>
+            </w:r>
+          </w:p>
+        </w:tc>
+        <w:tc>
+          <w:tcPr>
+            <w:tcW w:w="0" w:type="auto"/>
+            <w:hideMark/>
+          </w:tcPr>
+          <w:p>
+            <w:pPr>
+              <w:spacing w:after="120" w:line="300" w:lineRule="auto"/>
+            </w:pPr>
+            <w:r>
+              <w:t>Tiếp nhận đánh giá, nhận xét trải nghiệm tour từ Khách hàng và hỗ trợ Nhân viên xem tổng hợp, lọc điểm chất lượng dịch vụ.</w:t>
+            </w:r>
+          </w:p>
+        </w:tc>
+      </w:tr>
+      <w:tr>
+        <w:tc>
+          <w:tcPr>
+            <w:tcW w:w="0" w:type="auto"/>
+            <w:hideMark/>
+          </w:tcPr>
+          <w:p>
+            <w:pPr>
+              <w:spacing w:after="120" w:line="300" w:lineRule="auto"/>
+            </w:pPr>
+            <w:r>
+              <w:t>Đối tượng sử dụng</w:t>
+            </w:r>
+          </w:p>
+        </w:tc>
+        <w:tc>
+          <w:tcPr>
+            <w:tcW w:w="0" w:type="auto"/>
+            <w:hideMark/>
+          </w:tcPr>
+          <w:p>
+            <w:pPr>
+              <w:spacing w:after="120" w:line="300" w:lineRule="auto"/>
+            </w:pPr>
+            <w:r>
+              <w:t>Khách hàng (Gửi đánh giá) và Nhân viên (Xem tổng hợp).</w:t>
+            </w:r>
+          </w:p>
+        </w:tc>
+      </w:tr>
+      <w:tr>
+        <w:tc>
+          <w:tcPr>
+            <w:tcW w:w="0" w:type="auto"/>
+            <w:hideMark/>
+          </w:tcPr>
+          <w:p>
+            <w:pPr>
+              <w:spacing w:after="120" w:line="300" w:lineRule="auto"/>
+            </w:pPr>
+            <w:r>
+              <w:lastRenderedPageBreak/>
+              <w:t>Đọc/Ghi dữ liệu</w:t>
+            </w:r>
+          </w:p>
+        </w:tc>
+        <w:tc>
+          <w:tcPr>
+            <w:tcW w:w="0" w:type="auto"/>
+            <w:hideMark/>
+          </w:tcPr>
+          <w:p>
+            <w:pPr>
+              <w:spacing w:after="120" w:line="300" w:lineRule="auto"/>
+              <w:rPr>
+                <w:lang w:val="vi-VN"/>
+              </w:rPr>
+            </w:pPr>
+            <w:r>
+              <w:t>- Đọc: Bảng Customer, User, Tour, VeTourLe, ChuyenDiLe, PhieuDangKyDoan, PhieuKhaoSat.</w:t>
+            </w:r>
+          </w:p>
+          <w:p>
+            <w:pPr>
+              <w:spacing w:after="120" w:line="300" w:lineRule="auto"/>
+              <w:rPr>
+                <w:lang w:val="vi-VN"/>
+              </w:rPr>
+            </w:pPr>
+            <w:r>
+              <w:rPr>
+                <w:lang w:val="vi-VN"/>
+              </w:rPr>
+              <w:t>- Ghi: Bảng PhieuKhaoSat (thêm bản ghi đánh giá).</w:t>
+            </w:r>
+          </w:p>
+        </w:tc>
+      </w:tr>
+      <w:tr>
+        <w:tc>
+          <w:tcPr>
+            <w:tcW w:w="0" w:type="auto"/>
+            <w:hideMark/>
+          </w:tcPr>
+          <w:p>
+            <w:pPr>
+              <w:spacing w:after="120" w:line="300" w:lineRule="auto"/>
+            </w:pPr>
+            <w:r>
+              <w:t>Input/Output</w:t>
+            </w:r>
+          </w:p>
+        </w:tc>
+        <w:tc>
+          <w:tcPr>
+            <w:tcW w:w="0" w:type="auto"/>
+            <w:hideMark/>
+          </w:tcPr>
+          <w:p>
+            <w:pPr>
+              <w:spacing w:after="120" w:line="300" w:lineRule="auto"/>
+              <w:rPr>
+                <w:lang w:val="vi-VN"/>
+              </w:rPr>
+            </w:pPr>
+            <w:r>
+              <w:t>- Input: Chọn Khách hàng, chọn Tour đã đi, chọn số sao (1-5), nhập nhận xét; Chọn Tour để lọc xem.</w:t>
+            </w:r>
+          </w:p>
+          <w:p>
+            <w:pPr>
+              <w:spacing w:after="120" w:line="300" w:lineRule="auto"/>
+              <w:rPr>
+                <w:lang w:val="vi-VN"/>
+              </w:rPr>
+            </w:pPr>
+            <w:r>
+              <w:rPr>
+                <w:lang w:val="vi-VN"/>
+              </w:rPr>
+              <w:t>- Output: Lưu phiếu khảo sát; Báo lỗi nếu quá hạn 30 ngày hoặc đã đánh giá; Hiển thị DataGridView tổng hợp và Điểm trung bình (TB).</w:t>
+            </w:r>
+          </w:p>
+        </w:tc>
+      </w:tr>
+      <w:tr>
+        <w:tc>
+          <w:tcPr>
+            <w:tcW w:w="0" w:type="auto"/>
+            <w:hideMark/>
+          </w:tcPr>
+          <w:p>
+            <w:pPr>
+              <w:spacing w:after="120" w:line="300" w:lineRule="auto"/>
+            </w:pPr>
+            <w:r>
+              <w:t>Kịch bản/Validation</w:t>
+            </w:r>
+          </w:p>
+        </w:tc>
+        <w:tc>
+          <w:tcPr>
+            <w:tcW w:w="0" w:type="auto"/>
+            <w:hideMark/>
+          </w:tcPr>
+          <w:p>
+            <w:pPr>
+              <w:spacing w:after="120" w:line="300" w:lineRule="auto"/>
+            </w:pPr>
+            <w:r>
+              <w:t>Tự động lọc danh sách các tour khách đã đi; Tự động khóa/báo lỗi nếu tour kết thúc quá 30 ngày quy định (Flow 7a); Ràng buộc 1 khách chỉ khảo sát 1 lần/tour; Tự động tính điểm TB theo lọc.</w:t>
+            </w:r>
+          </w:p>
+        </w:tc>
+      </w:tr>
+    </w:tbl>
+    <w:p>
+      <w:pPr>
+        <w:spacing w:after="120" w:line="300" w:lineRule="auto"/>
+        <w:ind w:left="504" w:hanging="504"/>
+        <w:rPr>
+          <w:lang w:val="vi-VN"/>
+        </w:rPr>
+      </w:pPr>
+    </w:p>
+    <w:tbl>
+      <w:tblPr>
+        <w:tblStyle w:val="TableGrid"/>
+        <w:tblW w:w="0" w:type="auto"/>
+        <w:tblLook w:val="04A0" w:firstRow="1" w:lastRow="0" w:firstColumn="1" w:lastColumn="0" w:noHBand="0" w:noVBand="1"/>
+      </w:tblPr>
+      <w:tblGrid>
+        <w:gridCol w:w="2389"/>
+        <w:gridCol w:w="1936"/>
+        <w:gridCol w:w="5019"/>
+      </w:tblGrid>
+      <w:tr>
+        <w:tc>
+          <w:tcPr>
+            <w:tcW w:w="0" w:type="auto"/>
+            <w:hideMark/>
+          </w:tcPr>
+          <w:p>
+            <w:pPr>
+              <w:spacing w:after="120" w:line="300" w:lineRule="auto"/>
+              <w:ind w:left="504" w:hanging="504"/>
+            </w:pPr>
+            <w:r>
+              <w:rPr>
+                <w:b/>
+                <w:bCs/>
+              </w:rPr>
+              <w:t>(Name)</w:t>
+            </w:r>
+          </w:p>
+        </w:tc>
+        <w:tc>
+          <w:tcPr>
+            <w:tcW w:w="0" w:type="auto"/>
+            <w:hideMark/>
+          </w:tcPr>
+          <w:p>
+            <w:pPr>
+              <w:spacing w:after="120" w:line="300" w:lineRule="auto"/>
+              <w:ind w:left="504" w:hanging="504"/>
+            </w:pPr>
+            <w:r>
+              <w:rPr>
+                <w:b/>
+                <w:bCs/>
+              </w:rPr>
+              <w:t>Control</w:t>
+            </w:r>
+          </w:p>
+        </w:tc>
+        <w:tc>
+          <w:tcPr>
+            <w:tcW w:w="0" w:type="auto"/>
+            <w:hideMark/>
+          </w:tcPr>
+          <w:p>
+            <w:pPr>
+              <w:spacing w:after="120" w:line="300" w:lineRule="auto"/>
+              <w:ind w:left="504" w:hanging="504"/>
+            </w:pPr>
+            <w:r>
+              <w:rPr>
+                <w:b/>
+                <w:bCs/>
+              </w:rPr>
+              <w:t>Ý nghĩa</w:t>
+            </w:r>
+          </w:p>
+        </w:tc>
+      </w:tr>
+      <w:tr>
+        <w:tc>
+          <w:tcPr>
+            <w:tcW w:w="0" w:type="auto"/>
+            <w:hideMark/>
+          </w:tcPr>
+          <w:p>
+            <w:pPr>
+              <w:spacing w:after="120" w:line="300" w:lineRule="auto"/>
+              <w:ind w:left="504" w:hanging="504"/>
+            </w:pPr>
+            <w:r>
+              <w:t>tabControlMain</w:t>
+            </w:r>
+          </w:p>
+        </w:tc>
+        <w:tc>
+          <w:tcPr>
+            <w:tcW w:w="0" w:type="auto"/>
+            <w:hideMark/>
+          </w:tcPr>
+          <w:p>
+            <w:pPr>
+              <w:spacing w:after="120" w:line="300" w:lineRule="auto"/>
+              <w:ind w:left="504" w:hanging="504"/>
+            </w:pPr>
+            <w:r>
+              <w:t>TabControl</w:t>
+            </w:r>
+          </w:p>
+        </w:tc>
+        <w:tc>
+          <w:tcPr>
+            <w:tcW w:w="0" w:type="auto"/>
+            <w:hideMark/>
+          </w:tcPr>
+          <w:p>
+            <w:pPr>
+              <w:spacing w:after="120" w:line="300" w:lineRule="auto"/>
+            </w:pPr>
+            <w:r>
+              <w:t>Quản lý chuyển đổi giữa Tab Gửi đánh giá và Tab Tổng hợp ý kiến.</w:t>
+            </w:r>
+          </w:p>
+        </w:tc>
+      </w:tr>
+      <w:tr>
+        <w:tc>
+          <w:tcPr>
+            <w:tcW w:w="0" w:type="auto"/>
+            <w:hideMark/>
+          </w:tcPr>
+          <w:p>
+            <w:pPr>
+              <w:spacing w:after="120" w:line="300" w:lineRule="auto"/>
+              <w:ind w:left="504" w:hanging="504"/>
+            </w:pPr>
+            <w:r>
+              <w:t>tabGuiKhaoSat</w:t>
+            </w:r>
+          </w:p>
+        </w:tc>
+        <w:tc>
+          <w:tcPr>
+            <w:tcW w:w="0" w:type="auto"/>
+            <w:hideMark/>
+          </w:tcPr>
+          <w:p>
+            <w:pPr>
+              <w:spacing w:after="120" w:line="300" w:lineRule="auto"/>
+              <w:ind w:left="504" w:hanging="504"/>
+            </w:pPr>
+            <w:r>
+              <w:t>TabPage</w:t>
+            </w:r>
+          </w:p>
+        </w:tc>
+        <w:tc>
+          <w:tcPr>
+            <w:tcW w:w="0" w:type="auto"/>
+            <w:hideMark/>
+          </w:tcPr>
+          <w:p>
+            <w:pPr>
+              <w:spacing w:after="120" w:line="300" w:lineRule="auto"/>
+            </w:pPr>
+            <w:r>
+              <w:t>Chứa giao diện cho Khách hàng thực hiện khảo sát.</w:t>
+            </w:r>
+          </w:p>
+        </w:tc>
+      </w:tr>
+      <w:tr>
+        <w:tc>
+          <w:tcPr>
+            <w:tcW w:w="0" w:type="auto"/>
+            <w:hideMark/>
+          </w:tcPr>
+          <w:p>
+            <w:pPr>
+              <w:spacing w:after="120" w:line="300" w:lineRule="auto"/>
+              <w:ind w:left="504" w:hanging="504"/>
+            </w:pPr>
+            <w:r>
+              <w:t>cboKhachHang</w:t>
+            </w:r>
+          </w:p>
+        </w:tc>
+        <w:tc>
+          <w:tcPr>
+            <w:tcW w:w="0" w:type="auto"/>
+            <w:hideMark/>
+          </w:tcPr>
+          <w:p>
+            <w:pPr>
+              <w:spacing w:after="120" w:line="300" w:lineRule="auto"/>
+              <w:ind w:left="504" w:hanging="504"/>
+            </w:pPr>
+            <w:r>
+              <w:t>ComboBox</w:t>
+            </w:r>
+          </w:p>
+        </w:tc>
+        <w:tc>
+          <w:tcPr>
+            <w:tcW w:w="0" w:type="auto"/>
+            <w:hideMark/>
+          </w:tcPr>
+          <w:p>
+            <w:pPr>
+              <w:spacing w:after="120" w:line="300" w:lineRule="auto"/>
+            </w:pPr>
+            <w:r>
+              <w:t>Danh sách chọn Khách hàng thực hiện đánh giá.</w:t>
+            </w:r>
+          </w:p>
+        </w:tc>
+      </w:tr>
+      <w:tr>
+        <w:tc>
+          <w:tcPr>
+            <w:tcW w:w="0" w:type="auto"/>
+            <w:hideMark/>
+          </w:tcPr>
+          <w:p>
+            <w:pPr>
+              <w:spacing w:after="120" w:line="300" w:lineRule="auto"/>
+              <w:ind w:left="504" w:hanging="504"/>
+            </w:pPr>
+            <w:r>
+              <w:t>cboTourDaDi</w:t>
+            </w:r>
+          </w:p>
+        </w:tc>
+        <w:tc>
+          <w:tcPr>
+            <w:tcW w:w="0" w:type="auto"/>
+            <w:hideMark/>
+          </w:tcPr>
+          <w:p>
+            <w:pPr>
+              <w:spacing w:after="120" w:line="300" w:lineRule="auto"/>
+              <w:ind w:left="504" w:hanging="504"/>
+            </w:pPr>
+            <w:r>
+              <w:t>ComboBox</w:t>
+            </w:r>
+          </w:p>
+        </w:tc>
+        <w:tc>
+          <w:tcPr>
+            <w:tcW w:w="0" w:type="auto"/>
+            <w:hideMark/>
+          </w:tcPr>
+          <w:p>
+            <w:pPr>
+              <w:spacing w:after="120" w:line="300" w:lineRule="auto"/>
+            </w:pPr>
+            <w:r>
+              <w:t>Danh sách các Tour mà khách hàng được chọn đã tham gia.</w:t>
+            </w:r>
+          </w:p>
+        </w:tc>
+      </w:tr>
+      <w:tr>
+        <w:tc>
+          <w:tcPr>
+            <w:tcW w:w="0" w:type="auto"/>
+            <w:hideMark/>
+          </w:tcPr>
+          <w:p>
+            <w:pPr>
+              <w:spacing w:after="120" w:line="300" w:lineRule="auto"/>
+              <w:ind w:left="504" w:hanging="504"/>
+            </w:pPr>
+            <w:r>
+              <w:t>numDiemDanhGia</w:t>
+            </w:r>
+          </w:p>
+        </w:tc>
+        <w:tc>
+          <w:tcPr>
+            <w:tcW w:w="0" w:type="auto"/>
+            <w:hideMark/>
+          </w:tcPr>
+          <w:p>
+            <w:pPr>
+              <w:spacing w:after="120" w:line="300" w:lineRule="auto"/>
+              <w:ind w:left="504" w:hanging="504"/>
+            </w:pPr>
+            <w:r>
+              <w:t>NumericUpDown</w:t>
+            </w:r>
+          </w:p>
+        </w:tc>
+        <w:tc>
+          <w:tcPr>
+            <w:tcW w:w="0" w:type="auto"/>
+            <w:hideMark/>
+          </w:tcPr>
+          <w:p>
+            <w:pPr>
+              <w:spacing w:after="120" w:line="300" w:lineRule="auto"/>
+            </w:pPr>
+            <w:r>
+              <w:t>Chọn điểm đánh giá số sao (Thang điểm từ 1 đến 5).</w:t>
+            </w:r>
+          </w:p>
+        </w:tc>
+      </w:tr>
+      <w:tr>
+        <w:tc>
+          <w:tcPr>
+            <w:tcW w:w="0" w:type="auto"/>
+            <w:hideMark/>
+          </w:tcPr>
+          <w:p>
+            <w:pPr>
+              <w:spacing w:after="120" w:line="300" w:lineRule="auto"/>
+              <w:ind w:left="504" w:hanging="504"/>
+            </w:pPr>
+            <w:r>
+              <w:t>txtNhanXet</w:t>
+            </w:r>
+          </w:p>
+        </w:tc>
+        <w:tc>
+          <w:tcPr>
+            <w:tcW w:w="0" w:type="auto"/>
+            <w:hideMark/>
+          </w:tcPr>
+          <w:p>
+            <w:pPr>
+              <w:spacing w:after="120" w:line="300" w:lineRule="auto"/>
+              <w:ind w:left="504" w:hanging="504"/>
+            </w:pPr>
+            <w:r>
+              <w:t>TextBox</w:t>
+            </w:r>
+          </w:p>
+        </w:tc>
+        <w:tc>
+          <w:tcPr>
+            <w:tcW w:w="0" w:type="auto"/>
+            <w:hideMark/>
+          </w:tcPr>
+          <w:p>
+            <w:pPr>
+              <w:spacing w:after="120" w:line="300" w:lineRule="auto"/>
+            </w:pPr>
+            <w:r>
+              <w:t>Ô nhập nội dung nhận xét, góp ý chi tiết (Multiline).</w:t>
+            </w:r>
+          </w:p>
+        </w:tc>
+      </w:tr>
+      <w:tr>
+        <w:tc>
+          <w:tcPr>
+            <w:tcW w:w="0" w:type="auto"/>
+            <w:hideMark/>
+          </w:tcPr>
+          <w:p>
+            <w:pPr>
+              <w:spacing w:after="120" w:line="300" w:lineRule="auto"/>
+              <w:ind w:left="504" w:hanging="504"/>
+            </w:pPr>
+            <w:r>
+              <w:t>btnGuiKhaoSat</w:t>
+            </w:r>
+          </w:p>
+        </w:tc>
+        <w:tc>
+          <w:tcPr>
+            <w:tcW w:w="0" w:type="auto"/>
+            <w:hideMark/>
+          </w:tcPr>
+          <w:p>
+            <w:pPr>
+              <w:spacing w:after="120" w:line="300" w:lineRule="auto"/>
+              <w:ind w:left="504" w:hanging="504"/>
+            </w:pPr>
+            <w:r>
+              <w:t>Button</w:t>
+            </w:r>
+          </w:p>
+        </w:tc>
+        <w:tc>
+          <w:tcPr>
+            <w:tcW w:w="0" w:type="auto"/>
+            <w:hideMark/>
+          </w:tcPr>
+          <w:p>
+            <w:pPr>
+              <w:spacing w:after="120" w:line="300" w:lineRule="auto"/>
+            </w:pPr>
+            <w:r>
+              <w:t>Nút kiểm tra điều kiện và lưu thông tin khảo sát vào CSDL.</w:t>
+            </w:r>
+          </w:p>
+        </w:tc>
+      </w:tr>
+      <w:tr>
+        <w:tc>
+          <w:tcPr>
+            <w:tcW w:w="0" w:type="auto"/>
+            <w:hideMark/>
+          </w:tcPr>
+          <w:p>
+            <w:pPr>
+              <w:spacing w:after="120" w:line="300" w:lineRule="auto"/>
+              <w:ind w:left="504" w:hanging="504"/>
+            </w:pPr>
+            <w:r>
+              <w:t>lblStatusGui</w:t>
+            </w:r>
+          </w:p>
+        </w:tc>
+        <w:tc>
+          <w:tcPr>
+            <w:tcW w:w="0" w:type="auto"/>
+            <w:hideMark/>
+          </w:tcPr>
+          <w:p>
+            <w:pPr>
+              <w:spacing w:after="120" w:line="300" w:lineRule="auto"/>
+              <w:ind w:left="504" w:hanging="504"/>
+            </w:pPr>
+            <w:r>
+              <w:t>Label</w:t>
+            </w:r>
+          </w:p>
+        </w:tc>
+        <w:tc>
+          <w:tcPr>
+            <w:tcW w:w="0" w:type="auto"/>
+            <w:hideMark/>
+          </w:tcPr>
+          <w:p>
+            <w:pPr>
+              <w:spacing w:after="120" w:line="300" w:lineRule="auto"/>
+            </w:pPr>
+            <w:r>
+              <w:t>Nhãn hiển thị cảnh báo lỗi hoặc thông báo đóng khảo sát (chữ đỏ).</w:t>
+            </w:r>
+          </w:p>
+        </w:tc>
+      </w:tr>
+      <w:tr>
+        <w:tc>
+          <w:tcPr>
+            <w:tcW w:w="0" w:type="auto"/>
+            <w:hideMark/>
+          </w:tcPr>
+          <w:p>
+            <w:pPr>
+              <w:spacing w:after="120" w:line="300" w:lineRule="auto"/>
+              <w:ind w:left="504" w:hanging="504"/>
+            </w:pPr>
+            <w:r>
+              <w:t>tabTongHop</w:t>
+            </w:r>
+          </w:p>
+        </w:tc>
+        <w:tc>
+          <w:tcPr>
+            <w:tcW w:w="0" w:type="auto"/>
+            <w:hideMark/>
+          </w:tcPr>
+          <w:p>
+            <w:pPr>
+              <w:spacing w:after="120" w:line="300" w:lineRule="auto"/>
+              <w:ind w:left="504" w:hanging="504"/>
+            </w:pPr>
+            <w:r>
+              <w:t>TabPage</w:t>
+            </w:r>
+          </w:p>
+        </w:tc>
+        <w:tc>
+          <w:tcPr>
+            <w:tcW w:w="0" w:type="auto"/>
+            <w:hideMark/>
+          </w:tcPr>
+          <w:p>
+            <w:pPr>
+              <w:spacing w:after="120" w:line="300" w:lineRule="auto"/>
+            </w:pPr>
+            <w:r>
+              <w:t>Chứa giao diện cho Nhân viên xem tổng hợp đánh giá.</w:t>
+            </w:r>
+          </w:p>
+        </w:tc>
+      </w:tr>
+      <w:tr>
+        <w:tc>
+          <w:tcPr>
+            <w:tcW w:w="0" w:type="auto"/>
+            <w:hideMark/>
+          </w:tcPr>
+          <w:p>
+            <w:pPr>
+              <w:spacing w:after="120" w:line="300" w:lineRule="auto"/>
+              <w:ind w:left="504" w:hanging="504"/>
+            </w:pPr>
+            <w:r>
+              <w:t>cboFilterTour</w:t>
+            </w:r>
+          </w:p>
+        </w:tc>
+        <w:tc>
+          <w:tcPr>
+            <w:tcW w:w="0" w:type="auto"/>
+            <w:hideMark/>
+          </w:tcPr>
+          <w:p>
+            <w:pPr>
+              <w:spacing w:after="120" w:line="300" w:lineRule="auto"/>
+              <w:ind w:left="504" w:hanging="504"/>
+            </w:pPr>
+            <w:r>
+              <w:t>ComboBox</w:t>
+            </w:r>
+          </w:p>
+        </w:tc>
+        <w:tc>
+          <w:tcPr>
+            <w:tcW w:w="0" w:type="auto"/>
+            <w:hideMark/>
+          </w:tcPr>
+          <w:p>
+            <w:pPr>
+              <w:spacing w:after="120" w:line="300" w:lineRule="auto"/>
+            </w:pPr>
+            <w:r>
+              <w:t>Danh sách chọn lọc danh sách khảo sát theo từng Tour (hoặc Tất cả).</w:t>
+            </w:r>
+          </w:p>
+        </w:tc>
+      </w:tr>
+      <w:tr>
+        <w:tc>
+          <w:tcPr>
+            <w:tcW w:w="0" w:type="auto"/>
+            <w:hideMark/>
+          </w:tcPr>
+          <w:p>
+            <w:pPr>
+              <w:spacing w:after="120" w:line="300" w:lineRule="auto"/>
+              <w:ind w:left="504" w:hanging="504"/>
+            </w:pPr>
+            <w:r>
+              <w:t>lblDiemTrungBinh</w:t>
+            </w:r>
+          </w:p>
+        </w:tc>
+        <w:tc>
+          <w:tcPr>
+            <w:tcW w:w="0" w:type="auto"/>
+            <w:hideMark/>
+          </w:tcPr>
+          <w:p>
+            <w:pPr>
+              <w:spacing w:after="120" w:line="300" w:lineRule="auto"/>
+              <w:ind w:left="504" w:hanging="504"/>
+            </w:pPr>
+            <w:r>
+              <w:t>Label</w:t>
+            </w:r>
+          </w:p>
+        </w:tc>
+        <w:tc>
+          <w:tcPr>
+            <w:tcW w:w="0" w:type="auto"/>
+            <w:hideMark/>
+          </w:tcPr>
+          <w:p>
+            <w:pPr>
+              <w:spacing w:after="120" w:line="300" w:lineRule="auto"/>
+            </w:pPr>
+            <w:r>
+              <w:t>Nhãn hiển thị điểm đánh giá trung bình của Tour được chọn.</w:t>
+            </w:r>
+          </w:p>
+        </w:tc>
+      </w:tr>
+      <w:tr>
+        <w:tc>
+          <w:tcPr>
+            <w:tcW w:w="0" w:type="auto"/>
+            <w:hideMark/>
+          </w:tcPr>
+          <w:p>
+            <w:pPr>
+              <w:spacing w:after="120" w:line="300" w:lineRule="auto"/>
+              <w:ind w:left="504" w:hanging="504"/>
+            </w:pPr>
+            <w:r>
+              <w:t>dgvDanhSachKhaoSat</w:t>
+            </w:r>
+          </w:p>
+        </w:tc>
+        <w:tc>
+          <w:tcPr>
+            <w:tcW w:w="0" w:type="auto"/>
+            <w:hideMark/>
+          </w:tcPr>
+          <w:p>
+            <w:pPr>
+              <w:spacing w:after="120" w:line="300" w:lineRule="auto"/>
+              <w:ind w:left="504" w:hanging="504"/>
+            </w:pPr>
+            <w:r>
+              <w:t>DataGridView</w:t>
+            </w:r>
+          </w:p>
+        </w:tc>
+        <w:tc>
+          <w:tcPr>
+            <w:tcW w:w="0" w:type="auto"/>
+            <w:hideMark/>
+          </w:tcPr>
+          <w:p>
+            <w:pPr>
+              <w:spacing w:after="120" w:line="300" w:lineRule="auto"/>
+            </w:pPr>
+            <w:r>
+              <w:t>Bảng hiển thị danh sách chi tiết các phiếu khảo sát chất lượng.</w:t>
+            </w:r>
+          </w:p>
+        </w:tc>
+      </w:tr>
+    </w:tbl>
+    <w:p>
+      <w:pPr>
+        <w:spacing w:after="120" w:line="300" w:lineRule="auto"/>
+        <w:ind w:left="504" w:hanging="504"/>
+        <w:rPr>
+          <w:sz w:val="2"/>
+          <w:szCs w:val="2"/>
+          <w:lang w:val="vi-VN"/>
+        </w:rPr>
+      </w:pPr>
+    </w:p>
     <w:sectPr>
-      <w:footerReference w:type="default" r:id="rId15"/>
+      <w:footerReference w:type="default" r:id="rId19"/>
       <w:pgSz w:w="11906" w:h="16838"/>
       <w:pgMar w:top="1134" w:right="1134" w:bottom="1134" w:left="1418" w:header="708" w:footer="708" w:gutter="0"/>
       <w:cols w:space="720"/>
@@ -2656,105 +6964,10 @@
   <w:p>
     <w:pPr>
       <w:jc w:val="center"/>
+      <w:rPr>
+        <w:lang w:val="vi-VN"/>
+      </w:rPr>
     </w:pPr>
-    <w:r>
-      <w:rPr>
-        <w:color w:val="808080"/>
-        <w:sz w:val="18"/>
-        <w:szCs w:val="18"/>
-      </w:rPr>
-      <w:t xml:space="preserve">Trang </w:t>
-    </w:r>
-    <w:r>
-      <w:rPr>
-        <w:color w:val="808080"/>
-        <w:sz w:val="18"/>
-        <w:szCs w:val="18"/>
-      </w:rPr>
-      <w:fldChar w:fldCharType="begin"/>
-    </w:r>
-    <w:r>
-      <w:rPr>
-        <w:color w:val="808080"/>
-        <w:sz w:val="18"/>
-        <w:szCs w:val="18"/>
-      </w:rPr>
-      <w:instrText>PAGE</w:instrText>
-    </w:r>
-    <w:r>
-      <w:rPr>
-        <w:color w:val="808080"/>
-        <w:sz w:val="18"/>
-        <w:szCs w:val="18"/>
-      </w:rPr>
-      <w:fldChar w:fldCharType="separate"/>
-    </w:r>
-    <w:r>
-      <w:rPr>
-        <w:noProof/>
-        <w:color w:val="808080"/>
-        <w:sz w:val="18"/>
-        <w:szCs w:val="18"/>
-      </w:rPr>
-      <w:t>1</w:t>
-    </w:r>
-    <w:r>
-      <w:rPr>
-        <w:color w:val="808080"/>
-        <w:sz w:val="18"/>
-        <w:szCs w:val="18"/>
-      </w:rPr>
-      <w:fldChar w:fldCharType="end"/>
-    </w:r>
-    <w:r>
-      <w:rPr>
-        <w:color w:val="808080"/>
-        <w:sz w:val="18"/>
-        <w:szCs w:val="18"/>
-      </w:rPr>
-      <w:t xml:space="preserve"> / </w:t>
-    </w:r>
-    <w:r>
-      <w:rPr>
-        <w:color w:val="808080"/>
-        <w:sz w:val="18"/>
-        <w:szCs w:val="18"/>
-      </w:rPr>
-      <w:fldChar w:fldCharType="begin"/>
-    </w:r>
-    <w:r>
-      <w:rPr>
-        <w:color w:val="808080"/>
-        <w:sz w:val="18"/>
-        <w:szCs w:val="18"/>
-      </w:rPr>
-      <w:instrText>NUMPAGES</w:instrText>
-    </w:r>
-    <w:r>
-      <w:rPr>
-        <w:color w:val="808080"/>
-        <w:sz w:val="18"/>
-        <w:szCs w:val="18"/>
-      </w:rPr>
-      <w:fldChar w:fldCharType="separate"/>
-    </w:r>
-    <w:r>
-      <w:rPr>
-        <w:noProof/>
-        <w:color w:val="808080"/>
-        <w:sz w:val="18"/>
-        <w:szCs w:val="18"/>
-      </w:rPr>
-      <w:t>2</w:t>
-    </w:r>
-    <w:r>
-      <w:rPr>
-        <w:color w:val="808080"/>
-        <w:sz w:val="18"/>
-        <w:szCs w:val="18"/>
-      </w:rPr>
-      <w:fldChar w:fldCharType="end"/>
-    </w:r>
   </w:p>
 </w:ftr>
 </file>
@@ -6033,6 +10246,48 @@
       </w:tblBorders>
     </w:tblPr>
   </w:style>
+  <w:style w:type="paragraph" w:styleId="Header">
+    <w:name w:val="header"/>
+    <w:basedOn w:val="Normal"/>
+    <w:link w:val="HeaderChar"/>
+    <w:uiPriority w:val="99"/>
+    <w:unhideWhenUsed/>
+    <w:rsid w:val="00C46E56"/>
+    <w:pPr>
+      <w:tabs>
+        <w:tab w:val="center" w:pos="4680"/>
+        <w:tab w:val="right" w:pos="9360"/>
+      </w:tabs>
+    </w:pPr>
+  </w:style>
+  <w:style w:type="character" w:customStyle="1" w:styleId="HeaderChar">
+    <w:name w:val="Header Char"/>
+    <w:basedOn w:val="DefaultParagraphFont"/>
+    <w:link w:val="Header"/>
+    <w:uiPriority w:val="99"/>
+    <w:rsid w:val="00C46E56"/>
+  </w:style>
+  <w:style w:type="paragraph" w:styleId="Footer">
+    <w:name w:val="footer"/>
+    <w:basedOn w:val="Normal"/>
+    <w:link w:val="FooterChar"/>
+    <w:uiPriority w:val="99"/>
+    <w:unhideWhenUsed/>
+    <w:rsid w:val="00C46E56"/>
+    <w:pPr>
+      <w:tabs>
+        <w:tab w:val="center" w:pos="4680"/>
+        <w:tab w:val="right" w:pos="9360"/>
+      </w:tabs>
+    </w:pPr>
+  </w:style>
+  <w:style w:type="character" w:customStyle="1" w:styleId="FooterChar">
+    <w:name w:val="Footer Char"/>
+    <w:basedOn w:val="DefaultParagraphFont"/>
+    <w:link w:val="Footer"/>
+    <w:uiPriority w:val="99"/>
+    <w:rsid w:val="00C46E56"/>
+  </w:style>
 </w:styles>
 </file>
 

</xml_diff>